<commit_message>
Finaliza GeoAI Mentor com memória e portfólio
</commit_message>
<xml_diff>
--- a/Analise/RegistroPassoAPasso_Implementacao_GeoAI_Mentor.docx
+++ b/Analise/RegistroPassoAPasso_Implementacao_GeoAI_Mentor.docx
@@ -1385,6 +1385,145 @@
           <w:p>
             <w:r>
               <w:t>Prompt do GeoAI Mentor e cadeia prompt | modelo | parser validados com duas respostas reais.</w:t>
+            </w:r>
+          </w:p>
+        </w:tc>
+      </w:tr>
+      <w:tr>
+        <w:trPr>
+          <w:cantSplit/>
+        </w:trPr>
+        <w:tc>
+          <w:tcPr>
+            <w:tcW w:type="dxa" w:w="1900"/>
+          </w:tcPr>
+          <w:p>
+            <w:r>
+              <w:t>5 - Memória por sessão</w:t>
+            </w:r>
+          </w:p>
+        </w:tc>
+        <w:tc>
+          <w:tcPr>
+            <w:tcW w:type="dxa" w:w="1500"/>
+          </w:tcPr>
+          <w:p>
+            <w:r>
+              <w:t>16/08/2026</w:t>
+            </w:r>
+          </w:p>
+        </w:tc>
+        <w:tc>
+          <w:tcPr>
+            <w:tcW w:type="dxa" w:w="1600"/>
+          </w:tcPr>
+          <w:p>
+            <w:r>
+              <w:t>Concluída</w:t>
+            </w:r>
+          </w:p>
+        </w:tc>
+        <w:tc>
+          <w:tcPr>
+            <w:tcW w:type="dxa" w:w="4360"/>
+          </w:tcPr>
+          <w:p>
+            <w:r>
+              <w:t>Histórico singleton e RunnableWithMessageHistory validados; segunda pergunta preservou o contexto.</w:t>
+            </w:r>
+          </w:p>
+        </w:tc>
+      </w:tr>
+      <w:tr>
+        <w:trPr>
+          <w:cantSplit/>
+        </w:trPr>
+        <w:tc>
+          <w:tcPr>
+            <w:tcW w:type="dxa" w:w="1900"/>
+          </w:tcPr>
+          <w:p>
+            <w:r>
+              <w:t>6 - Revisão final</w:t>
+            </w:r>
+          </w:p>
+        </w:tc>
+        <w:tc>
+          <w:tcPr>
+            <w:tcW w:type="dxa" w:w="1500"/>
+          </w:tcPr>
+          <w:p>
+            <w:r>
+              <w:t>16/08/2026</w:t>
+            </w:r>
+          </w:p>
+        </w:tc>
+        <w:tc>
+          <w:tcPr>
+            <w:tcW w:type="dxa" w:w="1600"/>
+          </w:tcPr>
+          <w:p>
+            <w:r>
+              <w:t>Concluída</w:t>
+            </w:r>
+          </w:p>
+        </w:tc>
+        <w:tc>
+          <w:tcPr>
+            <w:tcW w:type="dxa" w:w="4360"/>
+          </w:tcPr>
+          <w:p>
+            <w:r>
+              <w:t>Credencial, template, invoke e memória auditados; todos os critérios foram aprovados.</w:t>
+            </w:r>
+          </w:p>
+        </w:tc>
+      </w:tr>
+      <w:tr>
+        <w:trPr>
+          <w:cantSplit/>
+        </w:trPr>
+        <w:tc>
+          <w:tcPr>
+            <w:tcW w:type="dxa" w:w="1900"/>
+            <w:shd w:fill="FFFFFF"/>
+          </w:tcPr>
+          <w:p>
+            <w:r>
+              <w:t>7 - Encerramento e portfólio</w:t>
+            </w:r>
+          </w:p>
+        </w:tc>
+        <w:tc>
+          <w:tcPr>
+            <w:tcW w:type="dxa" w:w="1500"/>
+            <w:shd w:fill="FFFFFF"/>
+          </w:tcPr>
+          <w:p>
+            <w:r>
+              <w:t>17/08/2026</w:t>
+            </w:r>
+          </w:p>
+        </w:tc>
+        <w:tc>
+          <w:tcPr>
+            <w:tcW w:type="dxa" w:w="1600"/>
+            <w:shd w:fill="FFFFFF"/>
+          </w:tcPr>
+          <w:p>
+            <w:r>
+              <w:t>Concluída</w:t>
+            </w:r>
+          </w:p>
+        </w:tc>
+        <w:tc>
+          <w:tcPr>
+            <w:tcW w:type="dxa" w:w="4360"/>
+            <w:shd w:fill="FFFFFF"/>
+          </w:tcPr>
+          <w:p>
+            <w:r>
+              <w:t>README, GIF, exemplos antes/depois, arquitetura, evidência real e relato de aprendizado preparados.</w:t>
             </w:r>
           </w:p>
         </w:tc>
@@ -7111,6 +7250,3540 @@
     <w:p>
       <w:r>
         <w:t>O chatbot passou a operar com identidade explícita de GeoAI Mentor e com uma cadeia LCEL modular. A integração foi validada em produção com respostas especializadas, saída textual simplificada e um ponto de extensão já preparado para memória conversacional.</w:t>
+      </w:r>
+    </w:p>
+    <w:p>
+      <w:pPr>
+        <w:pStyle w:val="Heading1"/>
+        <w:pageBreakBefore/>
+      </w:pPr>
+      <w:r>
+        <w:t>9. Etapa 5 - Memória conversacional por sessão</w:t>
+      </w:r>
+    </w:p>
+    <w:tbl>
+      <w:tblPr>
+        <w:tblStyle w:val="TableGrid"/>
+        <w:tblW w:type="auto" w:w="0"/>
+        <w:tblLook w:firstColumn="1" w:firstRow="1" w:lastColumn="0" w:lastRow="0" w:noHBand="0" w:noVBand="1" w:val="04A0"/>
+      </w:tblPr>
+      <w:tblGrid>
+        <w:gridCol w:w="4680"/>
+        <w:gridCol w:w="4680"/>
+      </w:tblGrid>
+      <w:tr>
+        <w:trPr>
+          <w:cantSplit/>
+        </w:trPr>
+        <w:tc>
+          <w:tcPr>
+            <w:tcW w:type="dxa" w:w="4680"/>
+          </w:tcPr>
+          <w:p>
+            <w:r>
+              <w:rPr>
+                <w:b/>
+              </w:rPr>
+              <w:t>Campo</w:t>
+            </w:r>
+          </w:p>
+        </w:tc>
+        <w:tc>
+          <w:tcPr>
+            <w:tcW w:type="dxa" w:w="4680"/>
+          </w:tcPr>
+          <w:p>
+            <w:r>
+              <w:rPr>
+                <w:b/>
+              </w:rPr>
+              <w:t>Registro</w:t>
+            </w:r>
+          </w:p>
+        </w:tc>
+      </w:tr>
+      <w:tr>
+        <w:trPr>
+          <w:cantSplit/>
+        </w:trPr>
+        <w:tc>
+          <w:tcPr>
+            <w:tcW w:type="dxa" w:w="4680"/>
+          </w:tcPr>
+          <w:p>
+            <w:r>
+              <w:t>Objetivo</w:t>
+            </w:r>
+          </w:p>
+        </w:tc>
+        <w:tc>
+          <w:tcPr>
+            <w:tcW w:type="dxa" w:w="4680"/>
+          </w:tcPr>
+          <w:p>
+            <w:r>
+              <w:t>Permitir que o GeoAI Mentor reutilize mensagens anteriores dentro da mesma sessão.</w:t>
+            </w:r>
+          </w:p>
+        </w:tc>
+      </w:tr>
+      <w:tr>
+        <w:trPr>
+          <w:cantSplit/>
+        </w:trPr>
+        <w:tc>
+          <w:tcPr>
+            <w:tcW w:type="dxa" w:w="4680"/>
+          </w:tcPr>
+          <w:p>
+            <w:r>
+              <w:t>Status</w:t>
+            </w:r>
+          </w:p>
+        </w:tc>
+        <w:tc>
+          <w:tcPr>
+            <w:tcW w:type="dxa" w:w="4680"/>
+          </w:tcPr>
+          <w:p>
+            <w:r>
+              <w:t>Concluída</w:t>
+            </w:r>
+          </w:p>
+        </w:tc>
+      </w:tr>
+      <w:tr>
+        <w:trPr>
+          <w:cantSplit/>
+        </w:trPr>
+        <w:tc>
+          <w:tcPr>
+            <w:tcW w:type="dxa" w:w="4680"/>
+          </w:tcPr>
+          <w:p>
+            <w:r>
+              <w:t>Armazenamento</w:t>
+            </w:r>
+          </w:p>
+        </w:tc>
+        <w:tc>
+          <w:tcPr>
+            <w:tcW w:type="dxa" w:w="4680"/>
+          </w:tcPr>
+          <w:p>
+            <w:r>
+              <w:t>Dicionário em memória, indexado por session_id</w:t>
+            </w:r>
+          </w:p>
+        </w:tc>
+      </w:tr>
+      <w:tr>
+        <w:trPr>
+          <w:cantSplit/>
+        </w:trPr>
+        <w:tc>
+          <w:tcPr>
+            <w:tcW w:type="dxa" w:w="4680"/>
+          </w:tcPr>
+          <w:p>
+            <w:r>
+              <w:t>Integração</w:t>
+            </w:r>
+          </w:p>
+        </w:tc>
+        <w:tc>
+          <w:tcPr>
+            <w:tcW w:type="dxa" w:w="4680"/>
+          </w:tcPr>
+          <w:p>
+            <w:r>
+              <w:t>RunnableWithMessageHistory envolvendo a cadeia LCEL do Passo 4</w:t>
+            </w:r>
+          </w:p>
+        </w:tc>
+      </w:tr>
+    </w:tbl>
+    <w:p>
+      <w:pPr>
+        <w:pStyle w:val="Heading2"/>
+      </w:pPr>
+      <w:r>
+        <w:t>9.1 Compatibilidade dos imports</w:t>
+      </w:r>
+    </w:p>
+    <w:p>
+      <w:r>
+        <w:t>O requisito indicava InMemoryChatMessageHistory em langchain.memory. Esse namespace não existe no langchain 1.3.15 instalado e gerou ModuleNotFoundError. A referência oficial atual do LangChain expõe a implementação em langchain_core.chat_history, caminho utilizado no projeto.</w:t>
+      </w:r>
+    </w:p>
+    <w:tbl>
+      <w:tblPr>
+        <w:tblStyle w:val="TableGrid"/>
+        <w:tblW w:type="auto" w:w="0"/>
+        <w:tblLook w:firstColumn="1" w:firstRow="1" w:lastColumn="0" w:lastRow="0" w:noHBand="0" w:noVBand="1" w:val="04A0"/>
+      </w:tblPr>
+      <w:tblGrid>
+        <w:gridCol w:w="3120"/>
+        <w:gridCol w:w="3120"/>
+        <w:gridCol w:w="3120"/>
+      </w:tblGrid>
+      <w:tr>
+        <w:trPr>
+          <w:cantSplit/>
+        </w:trPr>
+        <w:tc>
+          <w:tcPr>
+            <w:tcW w:type="dxa" w:w="3120"/>
+          </w:tcPr>
+          <w:p>
+            <w:r>
+              <w:rPr>
+                <w:b/>
+              </w:rPr>
+              <w:t>Componente</w:t>
+            </w:r>
+          </w:p>
+        </w:tc>
+        <w:tc>
+          <w:tcPr>
+            <w:tcW w:type="dxa" w:w="3120"/>
+          </w:tcPr>
+          <w:p>
+            <w:r>
+              <w:rPr>
+                <w:b/>
+              </w:rPr>
+              <w:t>Import solicitado</w:t>
+            </w:r>
+          </w:p>
+        </w:tc>
+        <w:tc>
+          <w:tcPr>
+            <w:tcW w:type="dxa" w:w="3120"/>
+          </w:tcPr>
+          <w:p>
+            <w:r>
+              <w:rPr>
+                <w:b/>
+              </w:rPr>
+              <w:t>Import utilizado</w:t>
+            </w:r>
+          </w:p>
+        </w:tc>
+      </w:tr>
+      <w:tr>
+        <w:trPr>
+          <w:cantSplit/>
+        </w:trPr>
+        <w:tc>
+          <w:tcPr>
+            <w:tcW w:type="dxa" w:w="3120"/>
+          </w:tcPr>
+          <w:p>
+            <w:r>
+              <w:t>InMemoryChatMessageHistory</w:t>
+            </w:r>
+          </w:p>
+        </w:tc>
+        <w:tc>
+          <w:tcPr>
+            <w:tcW w:type="dxa" w:w="3120"/>
+          </w:tcPr>
+          <w:p>
+            <w:r>
+              <w:t>langchain.memory</w:t>
+            </w:r>
+          </w:p>
+        </w:tc>
+        <w:tc>
+          <w:tcPr>
+            <w:tcW w:type="dxa" w:w="3120"/>
+          </w:tcPr>
+          <w:p>
+            <w:r>
+              <w:t>langchain_core.chat_history</w:t>
+            </w:r>
+          </w:p>
+        </w:tc>
+      </w:tr>
+      <w:tr>
+        <w:trPr>
+          <w:cantSplit/>
+        </w:trPr>
+        <w:tc>
+          <w:tcPr>
+            <w:tcW w:type="dxa" w:w="3120"/>
+          </w:tcPr>
+          <w:p>
+            <w:r>
+              <w:t>RunnableWithMessageHistory</w:t>
+            </w:r>
+          </w:p>
+        </w:tc>
+        <w:tc>
+          <w:tcPr>
+            <w:tcW w:type="dxa" w:w="3120"/>
+          </w:tcPr>
+          <w:p>
+            <w:r>
+              <w:t>langchain_core.runnables.history</w:t>
+            </w:r>
+          </w:p>
+        </w:tc>
+        <w:tc>
+          <w:tcPr>
+            <w:tcW w:type="dxa" w:w="3120"/>
+          </w:tcPr>
+          <w:p>
+            <w:r>
+              <w:t>langchain_core.runnables.history</w:t>
+            </w:r>
+          </w:p>
+        </w:tc>
+      </w:tr>
+    </w:tbl>
+    <w:p>
+      <w:pPr>
+        <w:pStyle w:val="Heading2"/>
+      </w:pPr>
+      <w:r>
+        <w:t>9.2 Armazenamento singleton por sessão</w:t>
+      </w:r>
+    </w:p>
+    <w:p>
+      <w:pPr>
+        <w:pStyle w:val="ListBullet"/>
+      </w:pPr>
+      <w:r>
+        <w:t>Criado memoria_sessoes como dicionário vazio, tipado por session_id e InMemoryChatMessageHistory.</w:t>
+      </w:r>
+    </w:p>
+    <w:p>
+      <w:pPr>
+        <w:pStyle w:val="ListBullet"/>
+      </w:pPr>
+      <w:r>
+        <w:t>obter_historico_por_sessao(session_id) cria uma instância somente quando a chave ainda não existe.</w:t>
+      </w:r>
+    </w:p>
+    <w:p>
+      <w:pPr>
+        <w:pStyle w:val="ListBullet"/>
+      </w:pPr>
+      <w:r>
+        <w:t>Chamadas posteriores com o mesmo identificador retornam exatamente o mesmo objeto de histórico.</w:t>
+      </w:r>
+    </w:p>
+    <w:p>
+      <w:pPr>
+        <w:pStyle w:val="ListBullet"/>
+      </w:pPr>
+      <w:r>
+        <w:t>Identificadores diferentes recebem instâncias diferentes, isolando as conversas.</w:t>
+      </w:r>
+    </w:p>
+    <w:p>
+      <w:pPr>
+        <w:pStyle w:val="Heading2"/>
+      </w:pPr>
+      <w:r>
+        <w:t>9.3 Configuração da cadeia com memória</w:t>
+      </w:r>
+    </w:p>
+    <w:tbl>
+      <w:tblPr>
+        <w:tblStyle w:val="TableGrid"/>
+        <w:tblW w:type="auto" w:w="0"/>
+        <w:tblLook w:firstColumn="1" w:firstRow="1" w:lastColumn="0" w:lastRow="0" w:noHBand="0" w:noVBand="1" w:val="04A0"/>
+      </w:tblPr>
+      <w:tblGrid>
+        <w:gridCol w:w="4680"/>
+        <w:gridCol w:w="4680"/>
+      </w:tblGrid>
+      <w:tr>
+        <w:trPr>
+          <w:cantSplit/>
+        </w:trPr>
+        <w:tc>
+          <w:tcPr>
+            <w:tcW w:type="dxa" w:w="4680"/>
+          </w:tcPr>
+          <w:p>
+            <w:r>
+              <w:rPr>
+                <w:b/>
+              </w:rPr>
+              <w:t>Parâmetro</w:t>
+            </w:r>
+          </w:p>
+        </w:tc>
+        <w:tc>
+          <w:tcPr>
+            <w:tcW w:type="dxa" w:w="4680"/>
+          </w:tcPr>
+          <w:p>
+            <w:r>
+              <w:rPr>
+                <w:b/>
+              </w:rPr>
+              <w:t>Configuração</w:t>
+            </w:r>
+          </w:p>
+        </w:tc>
+      </w:tr>
+      <w:tr>
+        <w:trPr>
+          <w:cantSplit/>
+        </w:trPr>
+        <w:tc>
+          <w:tcPr>
+            <w:tcW w:type="dxa" w:w="4680"/>
+          </w:tcPr>
+          <w:p>
+            <w:r>
+              <w:t>runnable</w:t>
+            </w:r>
+          </w:p>
+        </w:tc>
+        <w:tc>
+          <w:tcPr>
+            <w:tcW w:type="dxa" w:w="4680"/>
+          </w:tcPr>
+          <w:p>
+            <w:r>
+              <w:t>chain criada no Passo 4</w:t>
+            </w:r>
+          </w:p>
+        </w:tc>
+      </w:tr>
+      <w:tr>
+        <w:trPr>
+          <w:cantSplit/>
+        </w:trPr>
+        <w:tc>
+          <w:tcPr>
+            <w:tcW w:type="dxa" w:w="4680"/>
+          </w:tcPr>
+          <w:p>
+            <w:r>
+              <w:t>get_session_history</w:t>
+            </w:r>
+          </w:p>
+        </w:tc>
+        <w:tc>
+          <w:tcPr>
+            <w:tcW w:type="dxa" w:w="4680"/>
+          </w:tcPr>
+          <w:p>
+            <w:r>
+              <w:t>obter_historico_por_sessao</w:t>
+            </w:r>
+          </w:p>
+        </w:tc>
+      </w:tr>
+      <w:tr>
+        <w:trPr>
+          <w:cantSplit/>
+        </w:trPr>
+        <w:tc>
+          <w:tcPr>
+            <w:tcW w:type="dxa" w:w="4680"/>
+          </w:tcPr>
+          <w:p>
+            <w:r>
+              <w:t>input_messages_key</w:t>
+            </w:r>
+          </w:p>
+        </w:tc>
+        <w:tc>
+          <w:tcPr>
+            <w:tcW w:type="dxa" w:w="4680"/>
+          </w:tcPr>
+          <w:p>
+            <w:r>
+              <w:t>query</w:t>
+            </w:r>
+          </w:p>
+        </w:tc>
+      </w:tr>
+      <w:tr>
+        <w:trPr>
+          <w:cantSplit/>
+        </w:trPr>
+        <w:tc>
+          <w:tcPr>
+            <w:tcW w:type="dxa" w:w="4680"/>
+          </w:tcPr>
+          <w:p>
+            <w:r>
+              <w:t>history_messages_key</w:t>
+            </w:r>
+          </w:p>
+        </w:tc>
+        <w:tc>
+          <w:tcPr>
+            <w:tcW w:type="dxa" w:w="4680"/>
+          </w:tcPr>
+          <w:p>
+            <w:r>
+              <w:t>historico</w:t>
+            </w:r>
+          </w:p>
+        </w:tc>
+      </w:tr>
+    </w:tbl>
+    <w:p>
+      <w:pPr>
+        <w:pStyle w:val="Heading2"/>
+      </w:pPr>
+      <w:r>
+        <w:t>9.4 Invocação e ciclo da memória</w:t>
+      </w:r>
+    </w:p>
+    <w:p>
+      <w:pPr/>
+      <w:r>
+        <w:rPr>
+          <w:b/>
+        </w:rPr>
+        <w:t xml:space="preserve">Passo 1: </w:t>
+      </w:r>
+      <w:r>
+        <w:t>O laço recebe cadeia_com_memoria, perguntas e session_id.</w:t>
+      </w:r>
+    </w:p>
+    <w:p>
+      <w:pPr/>
+      <w:r>
+        <w:rPr>
+          <w:b/>
+        </w:rPr>
+        <w:t xml:space="preserve">Passo 2: </w:t>
+      </w:r>
+      <w:r>
+        <w:t>Cada pergunta é enviada em {'query': pergunta}.</w:t>
+      </w:r>
+    </w:p>
+    <w:p>
+      <w:pPr/>
+      <w:r>
+        <w:rPr>
+          <w:b/>
+        </w:rPr>
+        <w:t xml:space="preserve">Passo 3: </w:t>
+      </w:r>
+      <w:r>
+        <w:t>A configuração usa {'configurable': {'session_id': session_id}}.</w:t>
+      </w:r>
+    </w:p>
+    <w:p>
+      <w:pPr/>
+      <w:r>
+        <w:rPr>
+          <w:b/>
+        </w:rPr>
+        <w:t xml:space="preserve">Passo 4: </w:t>
+      </w:r>
+      <w:r>
+        <w:t>RunnableWithMessageHistory recupera o histórico antes da chamada e registra automaticamente a pergunta e a resposta depois dela.</w:t>
+      </w:r>
+    </w:p>
+    <w:p>
+      <w:pPr/>
+      <w:r>
+        <w:rPr>
+          <w:b/>
+        </w:rPr>
+        <w:t xml:space="preserve">Passo 5: </w:t>
+      </w:r>
+      <w:r>
+        <w:t>As duas perguntas de demonstração usam session_id='sessao_demo', formando uma única conversa.</w:t>
+      </w:r>
+    </w:p>
+    <w:p>
+      <w:pPr>
+        <w:pStyle w:val="Heading2"/>
+      </w:pPr>
+      <w:r>
+        <w:t>9.5 Testes e resultados</w:t>
+      </w:r>
+    </w:p>
+    <w:tbl>
+      <w:tblPr>
+        <w:tblStyle w:val="TableGrid"/>
+        <w:tblW w:type="auto" w:w="0"/>
+        <w:tblLook w:firstColumn="1" w:firstRow="1" w:lastColumn="0" w:lastRow="0" w:noHBand="0" w:noVBand="1" w:val="04A0"/>
+      </w:tblPr>
+      <w:tblGrid>
+        <w:gridCol w:w="3120"/>
+        <w:gridCol w:w="3120"/>
+        <w:gridCol w:w="3120"/>
+      </w:tblGrid>
+      <w:tr>
+        <w:trPr>
+          <w:cantSplit/>
+        </w:trPr>
+        <w:tc>
+          <w:tcPr>
+            <w:tcW w:type="dxa" w:w="3120"/>
+          </w:tcPr>
+          <w:p>
+            <w:r>
+              <w:rPr>
+                <w:b/>
+              </w:rPr>
+              <w:t>Teste</w:t>
+            </w:r>
+          </w:p>
+        </w:tc>
+        <w:tc>
+          <w:tcPr>
+            <w:tcW w:type="dxa" w:w="3120"/>
+          </w:tcPr>
+          <w:p>
+            <w:r>
+              <w:rPr>
+                <w:b/>
+              </w:rPr>
+              <w:t>Resultado</w:t>
+            </w:r>
+          </w:p>
+        </w:tc>
+        <w:tc>
+          <w:tcPr>
+            <w:tcW w:type="dxa" w:w="3120"/>
+          </w:tcPr>
+          <w:p>
+            <w:r>
+              <w:rPr>
+                <w:b/>
+              </w:rPr>
+              <w:t>Evidência</w:t>
+            </w:r>
+          </w:p>
+        </w:tc>
+      </w:tr>
+      <w:tr>
+        <w:trPr>
+          <w:cantSplit/>
+        </w:trPr>
+        <w:tc>
+          <w:tcPr>
+            <w:tcW w:type="dxa" w:w="3120"/>
+          </w:tcPr>
+          <w:p>
+            <w:r>
+              <w:t>Import solicitado</w:t>
+            </w:r>
+          </w:p>
+        </w:tc>
+        <w:tc>
+          <w:tcPr>
+            <w:tcW w:type="dxa" w:w="3120"/>
+          </w:tcPr>
+          <w:p>
+            <w:r>
+              <w:t>Incompatível</w:t>
+            </w:r>
+          </w:p>
+        </w:tc>
+        <w:tc>
+          <w:tcPr>
+            <w:tcW w:type="dxa" w:w="3120"/>
+          </w:tcPr>
+          <w:p>
+            <w:r>
+              <w:t>langchain.memory gerou ModuleNotFoundError.</w:t>
+            </w:r>
+          </w:p>
+        </w:tc>
+      </w:tr>
+      <w:tr>
+        <w:trPr>
+          <w:cantSplit/>
+        </w:trPr>
+        <w:tc>
+          <w:tcPr>
+            <w:tcW w:type="dxa" w:w="3120"/>
+          </w:tcPr>
+          <w:p>
+            <w:r>
+              <w:t>Compilação</w:t>
+            </w:r>
+          </w:p>
+        </w:tc>
+        <w:tc>
+          <w:tcPr>
+            <w:tcW w:type="dxa" w:w="3120"/>
+          </w:tcPr>
+          <w:p>
+            <w:r>
+              <w:t>Aprovada</w:t>
+            </w:r>
+          </w:p>
+        </w:tc>
+        <w:tc>
+          <w:tcPr>
+            <w:tcW w:type="dxa" w:w="3120"/>
+          </w:tcPr>
+          <w:p>
+            <w:r>
+              <w:t>chatbot_mentor.py compilou sem erros.</w:t>
+            </w:r>
+          </w:p>
+        </w:tc>
+      </w:tr>
+      <w:tr>
+        <w:trPr>
+          <w:cantSplit/>
+        </w:trPr>
+        <w:tc>
+          <w:tcPr>
+            <w:tcW w:type="dxa" w:w="3120"/>
+          </w:tcPr>
+          <w:p>
+            <w:r>
+              <w:t>Singleton</w:t>
+            </w:r>
+          </w:p>
+        </w:tc>
+        <w:tc>
+          <w:tcPr>
+            <w:tcW w:type="dxa" w:w="3120"/>
+          </w:tcPr>
+          <w:p>
+            <w:r>
+              <w:t>Aprovado</w:t>
+            </w:r>
+          </w:p>
+        </w:tc>
+        <w:tc>
+          <w:tcPr>
+            <w:tcW w:type="dxa" w:w="3120"/>
+          </w:tcPr>
+          <w:p>
+            <w:r>
+              <w:t>Mesmo session_id retornou o mesmo objeto; outra sessão retornou objeto distinto.</w:t>
+            </w:r>
+          </w:p>
+        </w:tc>
+      </w:tr>
+      <w:tr>
+        <w:trPr>
+          <w:cantSplit/>
+        </w:trPr>
+        <w:tc>
+          <w:tcPr>
+            <w:tcW w:type="dxa" w:w="3120"/>
+          </w:tcPr>
+          <w:p>
+            <w:r>
+              <w:t>Primeira chamada</w:t>
+            </w:r>
+          </w:p>
+        </w:tc>
+        <w:tc>
+          <w:tcPr>
+            <w:tcW w:type="dxa" w:w="3120"/>
+          </w:tcPr>
+          <w:p>
+            <w:r>
+              <w:t>Aprovada</w:t>
+            </w:r>
+          </w:p>
+        </w:tc>
+        <w:tc>
+          <w:tcPr>
+            <w:tcW w:type="dxa" w:w="3120"/>
+          </w:tcPr>
+          <w:p>
+            <w:r>
+              <w:t>O mentor recomendou Python como primeira linguagem.</w:t>
+            </w:r>
+          </w:p>
+        </w:tc>
+      </w:tr>
+      <w:tr>
+        <w:trPr>
+          <w:cantSplit/>
+        </w:trPr>
+        <w:tc>
+          <w:tcPr>
+            <w:tcW w:type="dxa" w:w="3120"/>
+          </w:tcPr>
+          <w:p>
+            <w:r>
+              <w:t>Segunda chamada</w:t>
+            </w:r>
+          </w:p>
+        </w:tc>
+        <w:tc>
+          <w:tcPr>
+            <w:tcW w:type="dxa" w:w="3120"/>
+          </w:tcPr>
+          <w:p>
+            <w:r>
+              <w:t>Aprovada</w:t>
+            </w:r>
+          </w:p>
+        </w:tc>
+        <w:tc>
+          <w:tcPr>
+            <w:tcW w:type="dxa" w:w="3120"/>
+          </w:tcPr>
+          <w:p>
+            <w:r>
+              <w:t>O mentor interpretou 'essa linguagem' como Python e sugeriu projetos em Python.</w:t>
+            </w:r>
+          </w:p>
+        </w:tc>
+      </w:tr>
+      <w:tr>
+        <w:trPr>
+          <w:cantSplit/>
+        </w:trPr>
+        <w:tc>
+          <w:tcPr>
+            <w:tcW w:type="dxa" w:w="3120"/>
+          </w:tcPr>
+          <w:p>
+            <w:r>
+              <w:t>Execução completa</w:t>
+            </w:r>
+          </w:p>
+        </w:tc>
+        <w:tc>
+          <w:tcPr>
+            <w:tcW w:type="dxa" w:w="3120"/>
+          </w:tcPr>
+          <w:p>
+            <w:r>
+              <w:t>Aprovada</w:t>
+            </w:r>
+          </w:p>
+        </w:tc>
+        <w:tc>
+          <w:tcPr>
+            <w:tcW w:type="dxa" w:w="3120"/>
+          </w:tcPr>
+          <w:p>
+            <w:r>
+              <w:t>As duas respostas foram impressas e o processo terminou com código zero.</w:t>
+            </w:r>
+          </w:p>
+        </w:tc>
+      </w:tr>
+    </w:tbl>
+    <w:p>
+      <w:pPr>
+        <w:pStyle w:val="Heading2"/>
+      </w:pPr>
+      <w:r>
+        <w:t>9.6 Correção de codificação do console</w:t>
+      </w:r>
+    </w:p>
+    <w:p>
+      <w:r>
+        <w:t>Na primeira validação completa, a segunda resposta foi gerada, mas sua impressão falhou porque o console Windows em CP-1252 não representava alguns caracteres Unicode. Foi adicionada a reconfiguração de sys.stdout para UTF-8 no início de main(). Após a correção, a execução terminou normalmente.</w:t>
+      </w:r>
+    </w:p>
+    <w:p>
+      <w:pPr>
+        <w:pStyle w:val="Heading2"/>
+      </w:pPr>
+      <w:r>
+        <w:t>9.7 Evidência funcional da memória</w:t>
+      </w:r>
+    </w:p>
+    <w:p>
+      <w:r>
+        <w:t>Antes da memória, a segunda pergunta fazia o modelo solicitar qual linguagem estava sendo mencionada. Com o mesmo session_id, a resposta passou a assumir corretamente Python e propôs um projeto de análise sísmica com dados públicos, além de alternativas como classificação de fácies, sinais sísmicos e dados gravimétricos. A mudança observada comprova a continuidade contextual dentro da sessão.</w:t>
+      </w:r>
+    </w:p>
+    <w:p>
+      <w:pPr>
+        <w:pStyle w:val="Heading2"/>
+      </w:pPr>
+      <w:r>
+        <w:t>9.8 Limitações e evolução futura</w:t>
+      </w:r>
+    </w:p>
+    <w:tbl>
+      <w:tblPr>
+        <w:tblStyle w:val="TableGrid"/>
+        <w:tblW w:type="auto" w:w="0"/>
+        <w:tblLook w:firstColumn="1" w:firstRow="1" w:lastColumn="0" w:lastRow="0" w:noHBand="0" w:noVBand="1" w:val="04A0"/>
+      </w:tblPr>
+      <w:tblGrid>
+        <w:gridCol w:w="4680"/>
+        <w:gridCol w:w="4680"/>
+      </w:tblGrid>
+      <w:tr>
+        <w:trPr>
+          <w:cantSplit/>
+        </w:trPr>
+        <w:tc>
+          <w:tcPr>
+            <w:tcW w:type="dxa" w:w="4680"/>
+          </w:tcPr>
+          <w:p>
+            <w:r>
+              <w:rPr>
+                <w:b/>
+              </w:rPr>
+              <w:t>Tema</w:t>
+            </w:r>
+          </w:p>
+        </w:tc>
+        <w:tc>
+          <w:tcPr>
+            <w:tcW w:type="dxa" w:w="4680"/>
+          </w:tcPr>
+          <w:p>
+            <w:r>
+              <w:rPr>
+                <w:b/>
+              </w:rPr>
+              <w:t>Registro</w:t>
+            </w:r>
+          </w:p>
+        </w:tc>
+      </w:tr>
+      <w:tr>
+        <w:trPr>
+          <w:cantSplit/>
+        </w:trPr>
+        <w:tc>
+          <w:tcPr>
+            <w:tcW w:type="dxa" w:w="4680"/>
+          </w:tcPr>
+          <w:p>
+            <w:r>
+              <w:t>Persistência</w:t>
+            </w:r>
+          </w:p>
+        </w:tc>
+        <w:tc>
+          <w:tcPr>
+            <w:tcW w:type="dxa" w:w="4680"/>
+          </w:tcPr>
+          <w:p>
+            <w:r>
+              <w:t>A memória é volátil e desaparece quando o processo Python termina.</w:t>
+            </w:r>
+          </w:p>
+        </w:tc>
+      </w:tr>
+      <w:tr>
+        <w:trPr>
+          <w:cantSplit/>
+        </w:trPr>
+        <w:tc>
+          <w:tcPr>
+            <w:tcW w:type="dxa" w:w="4680"/>
+          </w:tcPr>
+          <w:p>
+            <w:r>
+              <w:t>Escalabilidade</w:t>
+            </w:r>
+          </w:p>
+        </w:tc>
+        <w:tc>
+          <w:tcPr>
+            <w:tcW w:type="dxa" w:w="4680"/>
+          </w:tcPr>
+          <w:p>
+            <w:r>
+              <w:t>O dicionário local não é compartilhado entre processos ou servidores.</w:t>
+            </w:r>
+          </w:p>
+        </w:tc>
+      </w:tr>
+      <w:tr>
+        <w:trPr>
+          <w:cantSplit/>
+        </w:trPr>
+        <w:tc>
+          <w:tcPr>
+            <w:tcW w:type="dxa" w:w="4680"/>
+          </w:tcPr>
+          <w:p>
+            <w:r>
+              <w:t>Privacidade</w:t>
+            </w:r>
+          </w:p>
+        </w:tc>
+        <w:tc>
+          <w:tcPr>
+            <w:tcW w:type="dxa" w:w="4680"/>
+          </w:tcPr>
+          <w:p>
+            <w:r>
+              <w:t>Uma estratégia futura deve definir retenção, exclusão e segregação por usuário.</w:t>
+            </w:r>
+          </w:p>
+        </w:tc>
+      </w:tr>
+      <w:tr>
+        <w:trPr>
+          <w:cantSplit/>
+        </w:trPr>
+        <w:tc>
+          <w:tcPr>
+            <w:tcW w:type="dxa" w:w="4680"/>
+          </w:tcPr>
+          <w:p>
+            <w:r>
+              <w:t>Depreciação</w:t>
+            </w:r>
+          </w:p>
+        </w:tc>
+        <w:tc>
+          <w:tcPr>
+            <w:tcW w:type="dxa" w:w="4680"/>
+          </w:tcPr>
+          <w:p>
+            <w:r>
+              <w:t>A versão instalada emite aviso de que RunnableWithMessageHistory será substituído pela persistência nativa do LangGraph.</w:t>
+            </w:r>
+          </w:p>
+        </w:tc>
+      </w:tr>
+      <w:tr>
+        <w:trPr>
+          <w:cantSplit/>
+        </w:trPr>
+        <w:tc>
+          <w:tcPr>
+            <w:tcW w:type="dxa" w:w="4680"/>
+          </w:tcPr>
+          <w:p>
+            <w:r>
+              <w:t>Próxima evolução</w:t>
+            </w:r>
+          </w:p>
+        </w:tc>
+        <w:tc>
+          <w:tcPr>
+            <w:tcW w:type="dxa" w:w="4680"/>
+          </w:tcPr>
+          <w:p>
+            <w:r>
+              <w:t>Migrar para armazenamento persistente e avaliar LangGraph antes de produção.</w:t>
+            </w:r>
+          </w:p>
+        </w:tc>
+      </w:tr>
+    </w:tbl>
+    <w:p>
+      <w:pPr>
+        <w:pStyle w:val="Heading2"/>
+      </w:pPr>
+      <w:r>
+        <w:t>9.9 Arquivos alterados</w:t>
+      </w:r>
+    </w:p>
+    <w:tbl>
+      <w:tblPr>
+        <w:tblStyle w:val="TableGrid"/>
+        <w:tblW w:type="auto" w:w="0"/>
+        <w:tblLook w:firstColumn="1" w:firstRow="1" w:lastColumn="0" w:lastRow="0" w:noHBand="0" w:noVBand="1" w:val="04A0"/>
+      </w:tblPr>
+      <w:tblGrid>
+        <w:gridCol w:w="4680"/>
+        <w:gridCol w:w="4680"/>
+      </w:tblGrid>
+      <w:tr>
+        <w:trPr>
+          <w:cantSplit/>
+        </w:trPr>
+        <w:tc>
+          <w:tcPr>
+            <w:tcW w:type="dxa" w:w="4680"/>
+          </w:tcPr>
+          <w:p>
+            <w:r>
+              <w:rPr>
+                <w:b/>
+              </w:rPr>
+              <w:t>Caminho</w:t>
+            </w:r>
+          </w:p>
+        </w:tc>
+        <w:tc>
+          <w:tcPr>
+            <w:tcW w:type="dxa" w:w="4680"/>
+          </w:tcPr>
+          <w:p>
+            <w:r>
+              <w:rPr>
+                <w:b/>
+              </w:rPr>
+              <w:t>Alteração</w:t>
+            </w:r>
+          </w:p>
+        </w:tc>
+      </w:tr>
+      <w:tr>
+        <w:trPr>
+          <w:cantSplit/>
+        </w:trPr>
+        <w:tc>
+          <w:tcPr>
+            <w:tcW w:type="dxa" w:w="4680"/>
+          </w:tcPr>
+          <w:p>
+            <w:r>
+              <w:t>chatbot_mentor.py</w:t>
+            </w:r>
+          </w:p>
+        </w:tc>
+        <w:tc>
+          <w:tcPr>
+            <w:tcW w:type="dxa" w:w="4680"/>
+          </w:tcPr>
+          <w:p>
+            <w:r>
+              <w:t>Adicionados armazenamento, função singleton, wrapper de histórico, session_id e saída UTF-8.</w:t>
+            </w:r>
+          </w:p>
+        </w:tc>
+      </w:tr>
+      <w:tr>
+        <w:trPr>
+          <w:cantSplit/>
+        </w:trPr>
+        <w:tc>
+          <w:tcPr>
+            <w:tcW w:type="dxa" w:w="4680"/>
+          </w:tcPr>
+          <w:p>
+            <w:r>
+              <w:t>Analise/RegistroPassoAPasso_Implementacao_GeoAI_Mentor.docx</w:t>
+            </w:r>
+          </w:p>
+        </w:tc>
+        <w:tc>
+          <w:tcPr>
+            <w:tcW w:type="dxa" w:w="4680"/>
+          </w:tcPr>
+          <w:p>
+            <w:r>
+              <w:t>Incluído o registro técnico e executivo do Passo 5.</w:t>
+            </w:r>
+          </w:p>
+        </w:tc>
+      </w:tr>
+    </w:tbl>
+    <w:p>
+      <w:pPr>
+        <w:pStyle w:val="Heading2"/>
+      </w:pPr>
+      <w:r>
+        <w:t>9.10 Resumo executivo da etapa</w:t>
+      </w:r>
+    </w:p>
+    <w:p>
+      <w:r>
+        <w:t>O GeoAI Mentor passou a manter continuidade contextual durante uma sessão, completando o fluxo funcional proposto. A solução isola históricos por identificador, foi validada com chamadas reais e demonstrou melhora objetiva na segunda resposta. Para produção, resta substituir a memória volátil por persistência durável e planejar a migração recomendada para LangGraph.</w:t>
+      </w:r>
+    </w:p>
+    <w:p>
+      <w:pPr>
+        <w:pStyle w:val="Heading1"/>
+        <w:pageBreakBefore/>
+      </w:pPr>
+      <w:r>
+        <w:t>10. Etapa 6 - Revisão final da implementação</w:t>
+      </w:r>
+    </w:p>
+    <w:tbl>
+      <w:tblPr>
+        <w:tblStyle w:val="TableGrid"/>
+        <w:tblW w:type="auto" w:w="0"/>
+        <w:tblLook w:firstColumn="1" w:firstRow="1" w:lastColumn="0" w:lastRow="0" w:noHBand="0" w:noVBand="1" w:val="04A0"/>
+      </w:tblPr>
+      <w:tblGrid>
+        <w:gridCol w:w="4680"/>
+        <w:gridCol w:w="4680"/>
+      </w:tblGrid>
+      <w:tr>
+        <w:trPr>
+          <w:cantSplit/>
+        </w:trPr>
+        <w:tc>
+          <w:tcPr>
+            <w:tcW w:type="dxa" w:w="4680"/>
+          </w:tcPr>
+          <w:p>
+            <w:r>
+              <w:rPr>
+                <w:b/>
+              </w:rPr>
+              <w:t>Campo</w:t>
+            </w:r>
+          </w:p>
+        </w:tc>
+        <w:tc>
+          <w:tcPr>
+            <w:tcW w:type="dxa" w:w="4680"/>
+          </w:tcPr>
+          <w:p>
+            <w:r>
+              <w:rPr>
+                <w:b/>
+              </w:rPr>
+              <w:t>Registro</w:t>
+            </w:r>
+          </w:p>
+        </w:tc>
+      </w:tr>
+      <w:tr>
+        <w:trPr>
+          <w:cantSplit/>
+        </w:trPr>
+        <w:tc>
+          <w:tcPr>
+            <w:tcW w:type="dxa" w:w="4680"/>
+          </w:tcPr>
+          <w:p>
+            <w:r>
+              <w:t>Objetivo</w:t>
+            </w:r>
+          </w:p>
+        </w:tc>
+        <w:tc>
+          <w:tcPr>
+            <w:tcW w:type="dxa" w:w="4680"/>
+          </w:tcPr>
+          <w:p>
+            <w:r>
+              <w:t>Auditar os erros comuns indicados e confirmar a integridade funcional do fluxo completo.</w:t>
+            </w:r>
+          </w:p>
+        </w:tc>
+      </w:tr>
+      <w:tr>
+        <w:trPr>
+          <w:cantSplit/>
+        </w:trPr>
+        <w:tc>
+          <w:tcPr>
+            <w:tcW w:type="dxa" w:w="4680"/>
+          </w:tcPr>
+          <w:p>
+            <w:r>
+              <w:t>Status</w:t>
+            </w:r>
+          </w:p>
+        </w:tc>
+        <w:tc>
+          <w:tcPr>
+            <w:tcW w:type="dxa" w:w="4680"/>
+          </w:tcPr>
+          <w:p>
+            <w:r>
+              <w:t>Concluída sem não conformidades</w:t>
+            </w:r>
+          </w:p>
+        </w:tc>
+      </w:tr>
+      <w:tr>
+        <w:trPr>
+          <w:cantSplit/>
+        </w:trPr>
+        <w:tc>
+          <w:tcPr>
+            <w:tcW w:type="dxa" w:w="4680"/>
+          </w:tcPr>
+          <w:p>
+            <w:r>
+              <w:t>Escopo</w:t>
+            </w:r>
+          </w:p>
+        </w:tc>
+        <w:tc>
+          <w:tcPr>
+            <w:tcW w:type="dxa" w:w="4680"/>
+          </w:tcPr>
+          <w:p>
+            <w:r>
+              <w:t>Configuração, template, wrapper de memória, invoke, singleton e evidência contextual</w:t>
+            </w:r>
+          </w:p>
+        </w:tc>
+      </w:tr>
+      <w:tr>
+        <w:trPr>
+          <w:cantSplit/>
+        </w:trPr>
+        <w:tc>
+          <w:tcPr>
+            <w:tcW w:type="dxa" w:w="4680"/>
+          </w:tcPr>
+          <w:p>
+            <w:r>
+              <w:t>Consumo de API</w:t>
+            </w:r>
+          </w:p>
+        </w:tc>
+        <w:tc>
+          <w:tcPr>
+            <w:tcW w:type="dxa" w:w="4680"/>
+          </w:tcPr>
+          <w:p>
+            <w:r>
+              <w:t>Nenhuma chamada adicional; utilizada a evidência real aprovada no Passo 5</w:t>
+            </w:r>
+          </w:p>
+        </w:tc>
+      </w:tr>
+    </w:tbl>
+    <w:p>
+      <w:pPr>
+        <w:pStyle w:val="Heading2"/>
+      </w:pPr>
+      <w:r>
+        <w:t>10.1 Resultado consolidado do checklist</w:t>
+      </w:r>
+    </w:p>
+    <w:tbl>
+      <w:tblPr>
+        <w:tblStyle w:val="TableGrid"/>
+        <w:tblW w:type="auto" w:w="0"/>
+        <w:tblLook w:firstColumn="1" w:firstRow="1" w:lastColumn="0" w:lastRow="0" w:noHBand="0" w:noVBand="1" w:val="04A0"/>
+      </w:tblPr>
+      <w:tblGrid>
+        <w:gridCol w:w="2340"/>
+        <w:gridCol w:w="2340"/>
+        <w:gridCol w:w="2340"/>
+        <w:gridCol w:w="2340"/>
+      </w:tblGrid>
+      <w:tr>
+        <w:trPr>
+          <w:cantSplit/>
+        </w:trPr>
+        <w:tc>
+          <w:tcPr>
+            <w:tcW w:type="dxa" w:w="2340"/>
+          </w:tcPr>
+          <w:p>
+            <w:r>
+              <w:rPr>
+                <w:b/>
+              </w:rPr>
+              <w:t>Item</w:t>
+            </w:r>
+          </w:p>
+        </w:tc>
+        <w:tc>
+          <w:tcPr>
+            <w:tcW w:type="dxa" w:w="2340"/>
+          </w:tcPr>
+          <w:p>
+            <w:r>
+              <w:rPr>
+                <w:b/>
+              </w:rPr>
+              <w:t>Critério</w:t>
+            </w:r>
+          </w:p>
+        </w:tc>
+        <w:tc>
+          <w:tcPr>
+            <w:tcW w:type="dxa" w:w="2340"/>
+          </w:tcPr>
+          <w:p>
+            <w:r>
+              <w:rPr>
+                <w:b/>
+              </w:rPr>
+              <w:t>Resultado</w:t>
+            </w:r>
+          </w:p>
+        </w:tc>
+        <w:tc>
+          <w:tcPr>
+            <w:tcW w:type="dxa" w:w="2340"/>
+          </w:tcPr>
+          <w:p>
+            <w:r>
+              <w:rPr>
+                <w:b/>
+              </w:rPr>
+              <w:t>Evidência</w:t>
+            </w:r>
+          </w:p>
+        </w:tc>
+      </w:tr>
+      <w:tr>
+        <w:trPr>
+          <w:cantSplit/>
+        </w:trPr>
+        <w:tc>
+          <w:tcPr>
+            <w:tcW w:type="dxa" w:w="2340"/>
+          </w:tcPr>
+          <w:p>
+            <w:r>
+              <w:t>1</w:t>
+            </w:r>
+          </w:p>
+        </w:tc>
+        <w:tc>
+          <w:tcPr>
+            <w:tcW w:type="dxa" w:w="2340"/>
+          </w:tcPr>
+          <w:p>
+            <w:r>
+              <w:t>Variável OPENAI_API_KEY</w:t>
+            </w:r>
+          </w:p>
+        </w:tc>
+        <w:tc>
+          <w:tcPr>
+            <w:tcW w:type="dxa" w:w="2340"/>
+          </w:tcPr>
+          <w:p>
+            <w:r>
+              <w:t>Aprovado</w:t>
+            </w:r>
+          </w:p>
+        </w:tc>
+        <w:tc>
+          <w:tcPr>
+            <w:tcW w:type="dxa" w:w="2340"/>
+          </w:tcPr>
+          <w:p>
+            <w:r>
+              <w:t>O .env contém uma única atribuição com o nome e capitalização exatos; o valor não foi exibido.</w:t>
+            </w:r>
+          </w:p>
+        </w:tc>
+      </w:tr>
+      <w:tr>
+        <w:trPr>
+          <w:cantSplit/>
+        </w:trPr>
+        <w:tc>
+          <w:tcPr>
+            <w:tcW w:type="dxa" w:w="2340"/>
+          </w:tcPr>
+          <w:p>
+            <w:r>
+              <w:t>2</w:t>
+            </w:r>
+          </w:p>
+        </w:tc>
+        <w:tc>
+          <w:tcPr>
+            <w:tcW w:type="dxa" w:w="2340"/>
+          </w:tcPr>
+          <w:p>
+            <w:r>
+              <w:t>load_dotenv()</w:t>
+            </w:r>
+          </w:p>
+        </w:tc>
+        <w:tc>
+          <w:tcPr>
+            <w:tcW w:type="dxa" w:w="2340"/>
+          </w:tcPr>
+          <w:p>
+            <w:r>
+              <w:t>Aprovado</w:t>
+            </w:r>
+          </w:p>
+        </w:tc>
+        <w:tc>
+          <w:tcPr>
+            <w:tcW w:type="dxa" w:w="2340"/>
+          </w:tcPr>
+          <w:p>
+            <w:r>
+              <w:t>É chamado por carregar_configuracao() antes da criação de ChatOpenAI.</w:t>
+            </w:r>
+          </w:p>
+        </w:tc>
+      </w:tr>
+      <w:tr>
+        <w:trPr>
+          <w:cantSplit/>
+        </w:trPr>
+        <w:tc>
+          <w:tcPr>
+            <w:tcW w:type="dxa" w:w="2340"/>
+          </w:tcPr>
+          <w:p>
+            <w:r>
+              <w:t>3</w:t>
+            </w:r>
+          </w:p>
+        </w:tc>
+        <w:tc>
+          <w:tcPr>
+            <w:tcW w:type="dxa" w:w="2340"/>
+          </w:tcPr>
+          <w:p>
+            <w:r>
+              <w:t>Placeholder historico</w:t>
+            </w:r>
+          </w:p>
+        </w:tc>
+        <w:tc>
+          <w:tcPr>
+            <w:tcW w:type="dxa" w:w="2340"/>
+          </w:tcPr>
+          <w:p>
+            <w:r>
+              <w:t>Aprovado</w:t>
+            </w:r>
+          </w:p>
+        </w:tc>
+        <w:tc>
+          <w:tcPr>
+            <w:tcW w:type="dxa" w:w="2340"/>
+          </w:tcPr>
+          <w:p>
+            <w:r>
+              <w:t>{historico} corresponde a history_messages_key='historico'.</w:t>
+            </w:r>
+          </w:p>
+        </w:tc>
+      </w:tr>
+      <w:tr>
+        <w:trPr>
+          <w:cantSplit/>
+        </w:trPr>
+        <w:tc>
+          <w:tcPr>
+            <w:tcW w:type="dxa" w:w="2340"/>
+          </w:tcPr>
+          <w:p>
+            <w:r>
+              <w:t>4</w:t>
+            </w:r>
+          </w:p>
+        </w:tc>
+        <w:tc>
+          <w:tcPr>
+            <w:tcW w:type="dxa" w:w="2340"/>
+          </w:tcPr>
+          <w:p>
+            <w:r>
+              <w:t>Variável query</w:t>
+            </w:r>
+          </w:p>
+        </w:tc>
+        <w:tc>
+          <w:tcPr>
+            <w:tcW w:type="dxa" w:w="2340"/>
+          </w:tcPr>
+          <w:p>
+            <w:r>
+              <w:t>Aprovado</w:t>
+            </w:r>
+          </w:p>
+        </w:tc>
+        <w:tc>
+          <w:tcPr>
+            <w:tcW w:type="dxa" w:w="2340"/>
+          </w:tcPr>
+          <w:p>
+            <w:r>
+              <w:t>{query} corresponde a input_messages_key='query'.</w:t>
+            </w:r>
+          </w:p>
+        </w:tc>
+      </w:tr>
+      <w:tr>
+        <w:trPr>
+          <w:cantSplit/>
+        </w:trPr>
+        <w:tc>
+          <w:tcPr>
+            <w:tcW w:type="dxa" w:w="2340"/>
+          </w:tcPr>
+          <w:p>
+            <w:r>
+              <w:t>5</w:t>
+            </w:r>
+          </w:p>
+        </w:tc>
+        <w:tc>
+          <w:tcPr>
+            <w:tcW w:type="dxa" w:w="2340"/>
+          </w:tcPr>
+          <w:p>
+            <w:r>
+              <w:t>Entrada do invoke</w:t>
+            </w:r>
+          </w:p>
+        </w:tc>
+        <w:tc>
+          <w:tcPr>
+            <w:tcW w:type="dxa" w:w="2340"/>
+          </w:tcPr>
+          <w:p>
+            <w:r>
+              <w:t>Aprovado</w:t>
+            </w:r>
+          </w:p>
+        </w:tc>
+        <w:tc>
+          <w:tcPr>
+            <w:tcW w:type="dxa" w:w="2340"/>
+          </w:tcPr>
+          <w:p>
+            <w:r>
+              <w:t>A pergunta é enviada como {'query': pergunta}.</w:t>
+            </w:r>
+          </w:p>
+        </w:tc>
+      </w:tr>
+      <w:tr>
+        <w:trPr>
+          <w:cantSplit/>
+        </w:trPr>
+        <w:tc>
+          <w:tcPr>
+            <w:tcW w:type="dxa" w:w="2340"/>
+          </w:tcPr>
+          <w:p>
+            <w:r>
+              <w:t>6</w:t>
+            </w:r>
+          </w:p>
+        </w:tc>
+        <w:tc>
+          <w:tcPr>
+            <w:tcW w:type="dxa" w:w="2340"/>
+          </w:tcPr>
+          <w:p>
+            <w:r>
+              <w:t>Configuração de sessão</w:t>
+            </w:r>
+          </w:p>
+        </w:tc>
+        <w:tc>
+          <w:tcPr>
+            <w:tcW w:type="dxa" w:w="2340"/>
+          </w:tcPr>
+          <w:p>
+            <w:r>
+              <w:t>Aprovado</w:t>
+            </w:r>
+          </w:p>
+        </w:tc>
+        <w:tc>
+          <w:tcPr>
+            <w:tcW w:type="dxa" w:w="2340"/>
+          </w:tcPr>
+          <w:p>
+            <w:r>
+              <w:t>O config usa {'configurable': {'session_id': session_id}}.</w:t>
+            </w:r>
+          </w:p>
+        </w:tc>
+      </w:tr>
+      <w:tr>
+        <w:trPr>
+          <w:cantSplit/>
+        </w:trPr>
+        <w:tc>
+          <w:tcPr>
+            <w:tcW w:type="dxa" w:w="2340"/>
+          </w:tcPr>
+          <w:p>
+            <w:r>
+              <w:t>7</w:t>
+            </w:r>
+          </w:p>
+        </w:tc>
+        <w:tc>
+          <w:tcPr>
+            <w:tcW w:type="dxa" w:w="2340"/>
+          </w:tcPr>
+          <w:p>
+            <w:r>
+              <w:t>Singleton por sessão</w:t>
+            </w:r>
+          </w:p>
+        </w:tc>
+        <w:tc>
+          <w:tcPr>
+            <w:tcW w:type="dxa" w:w="2340"/>
+          </w:tcPr>
+          <w:p>
+            <w:r>
+              <w:t>Aprovado</w:t>
+            </w:r>
+          </w:p>
+        </w:tc>
+        <w:tc>
+          <w:tcPr>
+            <w:tcW w:type="dxa" w:w="2340"/>
+          </w:tcPr>
+          <w:p>
+            <w:r>
+              <w:t>Mesmo identificador retornou o mesmo objeto; identificador distinto recebeu outro histórico.</w:t>
+            </w:r>
+          </w:p>
+        </w:tc>
+      </w:tr>
+      <w:tr>
+        <w:trPr>
+          <w:cantSplit/>
+        </w:trPr>
+        <w:tc>
+          <w:tcPr>
+            <w:tcW w:type="dxa" w:w="2340"/>
+          </w:tcPr>
+          <w:p>
+            <w:r>
+              <w:t>8</w:t>
+            </w:r>
+          </w:p>
+        </w:tc>
+        <w:tc>
+          <w:tcPr>
+            <w:tcW w:type="dxa" w:w="2340"/>
+          </w:tcPr>
+          <w:p>
+            <w:r>
+              <w:t>Memória funcional</w:t>
+            </w:r>
+          </w:p>
+        </w:tc>
+        <w:tc>
+          <w:tcPr>
+            <w:tcW w:type="dxa" w:w="2340"/>
+          </w:tcPr>
+          <w:p>
+            <w:r>
+              <w:t>Aprovado</w:t>
+            </w:r>
+          </w:p>
+        </w:tc>
+        <w:tc>
+          <w:tcPr>
+            <w:tcW w:type="dxa" w:w="2340"/>
+          </w:tcPr>
+          <w:p>
+            <w:r>
+              <w:t>A segunda resposta interpretou 'essa linguagem' como Python e propôs projetos coerentes.</w:t>
+            </w:r>
+          </w:p>
+        </w:tc>
+      </w:tr>
+      <w:tr>
+        <w:trPr>
+          <w:cantSplit/>
+        </w:trPr>
+        <w:tc>
+          <w:tcPr>
+            <w:tcW w:type="dxa" w:w="2340"/>
+          </w:tcPr>
+          <w:p>
+            <w:r>
+              <w:t>9</w:t>
+            </w:r>
+          </w:p>
+        </w:tc>
+        <w:tc>
+          <w:tcPr>
+            <w:tcW w:type="dxa" w:w="2340"/>
+          </w:tcPr>
+          <w:p>
+            <w:r>
+              <w:t>Compilação</w:t>
+            </w:r>
+          </w:p>
+        </w:tc>
+        <w:tc>
+          <w:tcPr>
+            <w:tcW w:type="dxa" w:w="2340"/>
+          </w:tcPr>
+          <w:p>
+            <w:r>
+              <w:t>Aprovado</w:t>
+            </w:r>
+          </w:p>
+        </w:tc>
+        <w:tc>
+          <w:tcPr>
+            <w:tcW w:type="dxa" w:w="2340"/>
+          </w:tcPr>
+          <w:p>
+            <w:r>
+              <w:t>python -m py_compile terminou sem erros.</w:t>
+            </w:r>
+          </w:p>
+        </w:tc>
+      </w:tr>
+    </w:tbl>
+    <w:p>
+      <w:pPr>
+        <w:pStyle w:val="Heading2"/>
+      </w:pPr>
+      <w:r>
+        <w:t>10.2 Revisão da chave e carregamento do ambiente</w:t>
+      </w:r>
+    </w:p>
+    <w:p>
+      <w:r>
+        <w:t>A revisão leu somente a estrutura das linhas do .env. O valor da chave não foi impresso, copiado ou comparado externamente. Foi confirmada uma atribuição com o nome exato OPENAI_API_KEY e nenhuma variação de capitalização. carregar_configuracao() executa load_dotenv() e valida a variável antes de criar o modelo.</w:t>
+      </w:r>
+    </w:p>
+    <w:p>
+      <w:pPr>
+        <w:pStyle w:val="Heading2"/>
+      </w:pPr>
+      <w:r>
+        <w:t>10.3 Matriz de consistência das chaves</w:t>
+      </w:r>
+    </w:p>
+    <w:tbl>
+      <w:tblPr>
+        <w:tblStyle w:val="TableGrid"/>
+        <w:tblW w:type="auto" w:w="0"/>
+        <w:tblLook w:firstColumn="1" w:firstRow="1" w:lastColumn="0" w:lastRow="0" w:noHBand="0" w:noVBand="1" w:val="04A0"/>
+      </w:tblPr>
+      <w:tblGrid>
+        <w:gridCol w:w="3120"/>
+        <w:gridCol w:w="3120"/>
+        <w:gridCol w:w="3120"/>
+      </w:tblGrid>
+      <w:tr>
+        <w:trPr>
+          <w:cantSplit/>
+        </w:trPr>
+        <w:tc>
+          <w:tcPr>
+            <w:tcW w:type="dxa" w:w="3120"/>
+          </w:tcPr>
+          <w:p>
+            <w:r>
+              <w:rPr>
+                <w:b/>
+              </w:rPr>
+              <w:t>Conceito</w:t>
+            </w:r>
+          </w:p>
+        </w:tc>
+        <w:tc>
+          <w:tcPr>
+            <w:tcW w:type="dxa" w:w="3120"/>
+          </w:tcPr>
+          <w:p>
+            <w:r>
+              <w:rPr>
+                <w:b/>
+              </w:rPr>
+              <w:t>Template</w:t>
+            </w:r>
+          </w:p>
+        </w:tc>
+        <w:tc>
+          <w:tcPr>
+            <w:tcW w:type="dxa" w:w="3120"/>
+          </w:tcPr>
+          <w:p>
+            <w:r>
+              <w:rPr>
+                <w:b/>
+              </w:rPr>
+              <w:t>Wrapper de memória</w:t>
+            </w:r>
+          </w:p>
+        </w:tc>
+      </w:tr>
+      <w:tr>
+        <w:trPr>
+          <w:cantSplit/>
+        </w:trPr>
+        <w:tc>
+          <w:tcPr>
+            <w:tcW w:type="dxa" w:w="3120"/>
+          </w:tcPr>
+          <w:p>
+            <w:r>
+              <w:t>Pergunta atual</w:t>
+            </w:r>
+          </w:p>
+        </w:tc>
+        <w:tc>
+          <w:tcPr>
+            <w:tcW w:type="dxa" w:w="3120"/>
+          </w:tcPr>
+          <w:p>
+            <w:r>
+              <w:t>{query}</w:t>
+            </w:r>
+          </w:p>
+        </w:tc>
+        <w:tc>
+          <w:tcPr>
+            <w:tcW w:type="dxa" w:w="3120"/>
+          </w:tcPr>
+          <w:p>
+            <w:r>
+              <w:t>input_messages_key='query'</w:t>
+            </w:r>
+          </w:p>
+        </w:tc>
+      </w:tr>
+      <w:tr>
+        <w:trPr>
+          <w:cantSplit/>
+        </w:trPr>
+        <w:tc>
+          <w:tcPr>
+            <w:tcW w:type="dxa" w:w="3120"/>
+          </w:tcPr>
+          <w:p>
+            <w:r>
+              <w:t>Mensagens anteriores</w:t>
+            </w:r>
+          </w:p>
+        </w:tc>
+        <w:tc>
+          <w:tcPr>
+            <w:tcW w:type="dxa" w:w="3120"/>
+          </w:tcPr>
+          <w:p>
+            <w:r>
+              <w:t>{historico}</w:t>
+            </w:r>
+          </w:p>
+        </w:tc>
+        <w:tc>
+          <w:tcPr>
+            <w:tcW w:type="dxa" w:w="3120"/>
+          </w:tcPr>
+          <w:p>
+            <w:r>
+              <w:t>history_messages_key='historico'</w:t>
+            </w:r>
+          </w:p>
+        </w:tc>
+      </w:tr>
+    </w:tbl>
+    <w:p>
+      <w:pPr>
+        <w:pStyle w:val="Heading2"/>
+      </w:pPr>
+      <w:r>
+        <w:t>10.4 Estrutura validada da invocação</w:t>
+      </w:r>
+    </w:p>
+    <w:p>
+      <w:r>
+        <w:t>A cadeia com memória recebe dois argumentos: o primeiro dicionário contém a entrada humana; o segundo, nomeado config, contém o identificador da conversa dentro da chave configurable. Essa estrutura permite ao RunnableWithMessageHistory localizar o histórico correto antes de executar a cadeia.</w:t>
+      </w:r>
+    </w:p>
+    <w:p>
+      <w:pPr>
+        <w:pStyle w:val="IntenseQuote"/>
+      </w:pPr>
+      <w:r>
+        <w:t>cadeia_com_memoria.invoke({'query': pergunta}, config={'configurable': {'session_id': session_id}})</w:t>
+      </w:r>
+    </w:p>
+    <w:p>
+      <w:pPr>
+        <w:pStyle w:val="Heading2"/>
+      </w:pPr>
+      <w:r>
+        <w:t>10.5 Evidência da lógica de memória</w:t>
+      </w:r>
+    </w:p>
+    <w:p>
+      <w:r>
+        <w:t>No teste sem memória, a segunda pergunta solicitava esclarecimento sobre qual linguagem estava sendo usada. No teste do Passo 5, com as duas perguntas na sessão sessao_demo, a segunda resposta assumiu corretamente Python e sugeriu análise sísmica, classificação de fácies e outros projetos em Python. O contraste confirma que o contexto anterior foi recuperado e inserido no prompt.</w:t>
+      </w:r>
+    </w:p>
+    <w:p>
+      <w:pPr>
+        <w:pStyle w:val="Heading2"/>
+      </w:pPr>
+      <w:r>
+        <w:t>10.6 Verificações automatizadas executadas</w:t>
+      </w:r>
+    </w:p>
+    <w:p>
+      <w:pPr>
+        <w:pStyle w:val="ListBullet"/>
+      </w:pPr>
+      <w:r>
+        <w:t>Validação booleana da existência do .env sem exibição de conteúdo sensível.</w:t>
+      </w:r>
+    </w:p>
+    <w:p>
+      <w:pPr>
+        <w:pStyle w:val="ListBullet"/>
+      </w:pPr>
+      <w:r>
+        <w:t>Contagem de uma única atribuição OPENAI_API_KEY com capitalização exata.</w:t>
+      </w:r>
+    </w:p>
+    <w:p>
+      <w:pPr>
+        <w:pStyle w:val="ListBullet"/>
+      </w:pPr>
+      <w:r>
+        <w:t>Busca estrutural por load_dotenv(), placeholders, chaves do wrapper e config do invoke.</w:t>
+      </w:r>
+    </w:p>
+    <w:p>
+      <w:pPr>
+        <w:pStyle w:val="ListBullet"/>
+      </w:pPr>
+      <w:r>
+        <w:t>Compilação de chatbot_mentor.py com o interpretador da .venv.</w:t>
+      </w:r>
+    </w:p>
+    <w:p>
+      <w:pPr>
+        <w:pStyle w:val="ListBullet"/>
+      </w:pPr>
+      <w:r>
+        <w:t>Teste de identidade do objeto para mesma sessão e isolamento para sessão diferente.</w:t>
+      </w:r>
+    </w:p>
+    <w:p>
+      <w:pPr>
+        <w:pStyle w:val="ListBullet"/>
+      </w:pPr>
+      <w:r>
+        <w:t>Reutilização da evidência funcional real do Passo 5 para evitar consumo redundante de créditos.</w:t>
+      </w:r>
+    </w:p>
+    <w:p>
+      <w:pPr>
+        <w:pStyle w:val="Heading2"/>
+      </w:pPr>
+      <w:r>
+        <w:t>10.7 Observações não bloqueantes</w:t>
+      </w:r>
+    </w:p>
+    <w:tbl>
+      <w:tblPr>
+        <w:tblStyle w:val="TableGrid"/>
+        <w:tblW w:type="auto" w:w="0"/>
+        <w:tblLook w:firstColumn="1" w:firstRow="1" w:lastColumn="0" w:lastRow="0" w:noHBand="0" w:noVBand="1" w:val="04A0"/>
+      </w:tblPr>
+      <w:tblGrid>
+        <w:gridCol w:w="4680"/>
+        <w:gridCol w:w="4680"/>
+      </w:tblGrid>
+      <w:tr>
+        <w:trPr>
+          <w:cantSplit/>
+        </w:trPr>
+        <w:tc>
+          <w:tcPr>
+            <w:tcW w:type="dxa" w:w="4680"/>
+          </w:tcPr>
+          <w:p>
+            <w:r>
+              <w:rPr>
+                <w:b/>
+              </w:rPr>
+              <w:t>Tema</w:t>
+            </w:r>
+          </w:p>
+        </w:tc>
+        <w:tc>
+          <w:tcPr>
+            <w:tcW w:type="dxa" w:w="4680"/>
+          </w:tcPr>
+          <w:p>
+            <w:r>
+              <w:rPr>
+                <w:b/>
+              </w:rPr>
+              <w:t>Observação</w:t>
+            </w:r>
+          </w:p>
+        </w:tc>
+      </w:tr>
+      <w:tr>
+        <w:trPr>
+          <w:cantSplit/>
+        </w:trPr>
+        <w:tc>
+          <w:tcPr>
+            <w:tcW w:type="dxa" w:w="4680"/>
+          </w:tcPr>
+          <w:p>
+            <w:r>
+              <w:t>Compatibilidade</w:t>
+            </w:r>
+          </w:p>
+        </w:tc>
+        <w:tc>
+          <w:tcPr>
+            <w:tcW w:type="dxa" w:w="4680"/>
+          </w:tcPr>
+          <w:p>
+            <w:r>
+              <w:t>Imports antigos do material foram adaptados aos namespaces langchain_core da versão instalada.</w:t>
+            </w:r>
+          </w:p>
+        </w:tc>
+      </w:tr>
+      <w:tr>
+        <w:trPr>
+          <w:cantSplit/>
+        </w:trPr>
+        <w:tc>
+          <w:tcPr>
+            <w:tcW w:type="dxa" w:w="4680"/>
+          </w:tcPr>
+          <w:p>
+            <w:r>
+              <w:t>Depreciação</w:t>
+            </w:r>
+          </w:p>
+        </w:tc>
+        <w:tc>
+          <w:tcPr>
+            <w:tcW w:type="dxa" w:w="4680"/>
+          </w:tcPr>
+          <w:p>
+            <w:r>
+              <w:t>RunnableWithMessageHistory atende ao requisito, mas a versão atual recomenda persistência do LangGraph no futuro.</w:t>
+            </w:r>
+          </w:p>
+        </w:tc>
+      </w:tr>
+      <w:tr>
+        <w:trPr>
+          <w:cantSplit/>
+        </w:trPr>
+        <w:tc>
+          <w:tcPr>
+            <w:tcW w:type="dxa" w:w="4680"/>
+          </w:tcPr>
+          <w:p>
+            <w:r>
+              <w:t>Persistência</w:t>
+            </w:r>
+          </w:p>
+        </w:tc>
+        <w:tc>
+          <w:tcPr>
+            <w:tcW w:type="dxa" w:w="4680"/>
+          </w:tcPr>
+          <w:p>
+            <w:r>
+              <w:t>A memória atual dura somente enquanto o processo Python permanece em execução.</w:t>
+            </w:r>
+          </w:p>
+        </w:tc>
+      </w:tr>
+      <w:tr>
+        <w:trPr>
+          <w:cantSplit/>
+        </w:trPr>
+        <w:tc>
+          <w:tcPr>
+            <w:tcW w:type="dxa" w:w="4680"/>
+          </w:tcPr>
+          <w:p>
+            <w:r>
+              <w:t>Segurança</w:t>
+            </w:r>
+          </w:p>
+        </w:tc>
+        <w:tc>
+          <w:tcPr>
+            <w:tcW w:type="dxa" w:w="4680"/>
+          </w:tcPr>
+          <w:p>
+            <w:r>
+              <w:t>O .env continua fora do código e deve permanecer ignorado pelo Git.</w:t>
+            </w:r>
+          </w:p>
+        </w:tc>
+      </w:tr>
+    </w:tbl>
+    <w:p>
+      <w:pPr>
+        <w:pStyle w:val="Heading2"/>
+      </w:pPr>
+      <w:r>
+        <w:t>10.8 Conclusão executiva da revisão</w:t>
+      </w:r>
+    </w:p>
+    <w:p>
+      <w:r>
+        <w:t>Nenhum dos erros comuns listados foi encontrado na versão final. O GeoAI Mentor carrega a credencial de forma segura, mantém consistência entre o template e o wrapper, invoca a cadeia com a configuração correta e preserva o contexto dentro de uma sessão. A implementação dos passos propostos está funcionalmente concluída.</w:t>
+      </w:r>
+    </w:p>
+    <w:p>
+      <w:pPr>
+        <w:pStyle w:val="Heading1"/>
+        <w:keepNext/>
+      </w:pPr>
+      <w:r>
+        <w:t>11. Etapa 7 - Encerramento e preparação do portfólio</w:t>
+      </w:r>
+    </w:p>
+    <w:tbl>
+      <w:tblPr>
+        <w:tblStyle w:val="TableGrid"/>
+        <w:tblW w:type="auto" w:w="0"/>
+        <w:tblLook w:firstColumn="1" w:firstRow="1" w:lastColumn="0" w:lastRow="0" w:noHBand="0" w:noVBand="1" w:val="04A0"/>
+      </w:tblPr>
+      <w:tblGrid>
+        <w:gridCol w:w="4680"/>
+        <w:gridCol w:w="4680"/>
+      </w:tblGrid>
+      <w:tr>
+        <w:trPr>
+          <w:cantSplit/>
+        </w:trPr>
+        <w:tc>
+          <w:tcPr>
+            <w:tcW w:type="dxa" w:w="4680"/>
+            <w:vAlign w:val="center"/>
+            <w:shd w:fill="1F416B"/>
+          </w:tcPr>
+          <w:p>
+            <w:pPr>
+              <w:spacing w:after="0"/>
+            </w:pPr>
+            <w:r>
+              <w:rPr>
+                <w:rFonts w:ascii="Arial" w:hAnsi="Arial"/>
+                <w:b/>
+                <w:color w:val="FFFFFF"/>
+                <w:sz w:val="19"/>
+              </w:rPr>
+              <w:t>Campo</w:t>
+            </w:r>
+          </w:p>
+        </w:tc>
+        <w:tc>
+          <w:tcPr>
+            <w:tcW w:type="dxa" w:w="4680"/>
+            <w:vAlign w:val="center"/>
+            <w:shd w:fill="1F416B"/>
+          </w:tcPr>
+          <w:p>
+            <w:pPr>
+              <w:spacing w:after="0"/>
+            </w:pPr>
+            <w:r>
+              <w:rPr>
+                <w:rFonts w:ascii="Arial" w:hAnsi="Arial"/>
+                <w:b/>
+                <w:color w:val="FFFFFF"/>
+                <w:sz w:val="19"/>
+              </w:rPr>
+              <w:t>Registro</w:t>
+            </w:r>
+          </w:p>
+        </w:tc>
+      </w:tr>
+      <w:tr>
+        <w:trPr>
+          <w:cantSplit/>
+        </w:trPr>
+        <w:tc>
+          <w:tcPr>
+            <w:tcW w:type="dxa" w:w="4680"/>
+            <w:vAlign w:val="center"/>
+            <w:shd w:fill="FFFFFF"/>
+          </w:tcPr>
+          <w:p>
+            <w:pPr>
+              <w:spacing w:after="0"/>
+            </w:pPr>
+            <w:r>
+              <w:rPr>
+                <w:rFonts w:ascii="Arial" w:hAnsi="Arial"/>
+                <w:sz w:val="19"/>
+              </w:rPr>
+              <w:t>Objetivo</w:t>
+            </w:r>
+          </w:p>
+        </w:tc>
+        <w:tc>
+          <w:tcPr>
+            <w:tcW w:type="dxa" w:w="4680"/>
+            <w:vAlign w:val="center"/>
+            <w:shd w:fill="FFFFFF"/>
+          </w:tcPr>
+          <w:p>
+            <w:pPr>
+              <w:spacing w:after="0"/>
+            </w:pPr>
+            <w:r>
+              <w:rPr>
+                <w:rFonts w:ascii="Arial" w:hAnsi="Arial"/>
+                <w:sz w:val="19"/>
+              </w:rPr>
+              <w:t>Transformar a implementação validada em uma apresentação clara, reproduzível e visualmente demonstrável para portfólio.</w:t>
+            </w:r>
+          </w:p>
+        </w:tc>
+      </w:tr>
+      <w:tr>
+        <w:trPr>
+          <w:cantSplit/>
+        </w:trPr>
+        <w:tc>
+          <w:tcPr>
+            <w:tcW w:type="dxa" w:w="4680"/>
+            <w:vAlign w:val="center"/>
+            <w:shd w:fill="F2F4F7"/>
+          </w:tcPr>
+          <w:p>
+            <w:pPr>
+              <w:spacing w:after="0"/>
+            </w:pPr>
+            <w:r>
+              <w:rPr>
+                <w:rFonts w:ascii="Arial" w:hAnsi="Arial"/>
+                <w:sz w:val="19"/>
+              </w:rPr>
+              <w:t>Status</w:t>
+            </w:r>
+          </w:p>
+        </w:tc>
+        <w:tc>
+          <w:tcPr>
+            <w:tcW w:type="dxa" w:w="4680"/>
+            <w:vAlign w:val="center"/>
+            <w:shd w:fill="F2F4F7"/>
+          </w:tcPr>
+          <w:p>
+            <w:pPr>
+              <w:spacing w:after="0"/>
+            </w:pPr>
+            <w:r>
+              <w:rPr>
+                <w:rFonts w:ascii="Arial" w:hAnsi="Arial"/>
+                <w:sz w:val="19"/>
+              </w:rPr>
+              <w:t>Concluída localmente</w:t>
+            </w:r>
+          </w:p>
+        </w:tc>
+      </w:tr>
+      <w:tr>
+        <w:trPr>
+          <w:cantSplit/>
+        </w:trPr>
+        <w:tc>
+          <w:tcPr>
+            <w:tcW w:type="dxa" w:w="4680"/>
+            <w:vAlign w:val="center"/>
+            <w:shd w:fill="FFFFFF"/>
+          </w:tcPr>
+          <w:p>
+            <w:pPr>
+              <w:spacing w:after="0"/>
+            </w:pPr>
+            <w:r>
+              <w:rPr>
+                <w:rFonts w:ascii="Arial" w:hAnsi="Arial"/>
+                <w:sz w:val="19"/>
+              </w:rPr>
+              <w:t>Publicação</w:t>
+            </w:r>
+          </w:p>
+        </w:tc>
+        <w:tc>
+          <w:tcPr>
+            <w:tcW w:type="dxa" w:w="4680"/>
+            <w:vAlign w:val="center"/>
+            <w:shd w:fill="FFFFFF"/>
+          </w:tcPr>
+          <w:p>
+            <w:pPr>
+              <w:spacing w:after="0"/>
+            </w:pPr>
+            <w:r>
+              <w:rPr>
+                <w:rFonts w:ascii="Arial" w:hAnsi="Arial"/>
+                <w:sz w:val="19"/>
+              </w:rPr>
+              <w:t>Não realizada nesta etapa; nenhum commit ou push foi executado.</w:t>
+            </w:r>
+          </w:p>
+        </w:tc>
+      </w:tr>
+      <w:tr>
+        <w:trPr>
+          <w:cantSplit/>
+        </w:trPr>
+        <w:tc>
+          <w:tcPr>
+            <w:tcW w:type="dxa" w:w="4680"/>
+            <w:vAlign w:val="center"/>
+            <w:shd w:fill="F2F4F7"/>
+          </w:tcPr>
+          <w:p>
+            <w:pPr>
+              <w:spacing w:after="0"/>
+            </w:pPr>
+            <w:r>
+              <w:rPr>
+                <w:rFonts w:ascii="Arial" w:hAnsi="Arial"/>
+                <w:sz w:val="19"/>
+              </w:rPr>
+              <w:t>Evidência principal</w:t>
+            </w:r>
+          </w:p>
+        </w:tc>
+        <w:tc>
+          <w:tcPr>
+            <w:tcW w:type="dxa" w:w="4680"/>
+            <w:vAlign w:val="center"/>
+            <w:shd w:fill="F2F4F7"/>
+          </w:tcPr>
+          <w:p>
+            <w:pPr>
+              <w:spacing w:after="0"/>
+            </w:pPr>
+            <w:r>
+              <w:rPr>
+                <w:rFonts w:ascii="Arial" w:hAnsi="Arial"/>
+                <w:sz w:val="19"/>
+              </w:rPr>
+              <w:t>README.md e assets/geoai-mentor-demo.gif</w:t>
+            </w:r>
+          </w:p>
+        </w:tc>
+      </w:tr>
+    </w:tbl>
+    <w:p>
+      <w:pPr>
+        <w:pStyle w:val="Heading2"/>
+        <w:keepNext/>
+      </w:pPr>
+      <w:r>
+        <w:t>11.1 Entregas realizadas</w:t>
+      </w:r>
+    </w:p>
+    <w:p>
+      <w:pPr>
+        <w:pStyle w:val="ListBullet"/>
+      </w:pPr>
+      <w:r>
+        <w:t>Criado README.md com problema, benefícios, arquitetura, configuração, execução, testes, limitações e aprendizado.</w:t>
+      </w:r>
+    </w:p>
+    <w:p>
+      <w:pPr>
+        <w:pStyle w:val="ListBullet"/>
+      </w:pPr>
+      <w:r>
+        <w:t>Incluídos exemplos comparativos de conversa sem memória e com memória.</w:t>
+      </w:r>
+    </w:p>
+    <w:p>
+      <w:pPr>
+        <w:pStyle w:val="ListBullet"/>
+      </w:pPr>
+      <w:r>
+        <w:t>Criado GIF animado em assets/geoai-mentor-demo.gif com uma demonstração concisa do fluxo no terminal.</w:t>
+      </w:r>
+    </w:p>
+    <w:p>
+      <w:pPr>
+        <w:pStyle w:val="ListBullet"/>
+      </w:pPr>
+      <w:r>
+        <w:t>Documentada a cadeia LCEL: ChatPromptTemplate → ChatOpenAI → StrOutputParser.</w:t>
+      </w:r>
+    </w:p>
+    <w:p>
+      <w:pPr>
+        <w:pStyle w:val="ListBullet"/>
+      </w:pPr>
+      <w:r>
+        <w:t>Explicado o papel do RunnableWithMessageHistory, do session_id e do InMemoryChatMessageHistory.</w:t>
+      </w:r>
+    </w:p>
+    <w:p>
+      <w:pPr>
+        <w:pStyle w:val="ListBullet"/>
+      </w:pPr>
+      <w:r>
+        <w:t>Adicionadas instruções para proteger o .env e reproduzir a execução no Windows PowerShell.</w:t>
+      </w:r>
+    </w:p>
+    <w:p>
+      <w:pPr>
+        <w:pStyle w:val="Heading2"/>
+        <w:keepNext/>
+      </w:pPr>
+      <w:r>
+        <w:t>11.2 Evidência funcional atualizada</w:t>
+      </w:r>
+    </w:p>
+    <w:p>
+      <w:r>
+        <w:t>O script foi executado novamente com a chave configurada, realizando duas chamadas reais ao modelo. A execução terminou com código zero e preservou o contexto na mesma sessão.</w:t>
+      </w:r>
+    </w:p>
+    <w:tbl>
+      <w:tblPr>
+        <w:tblStyle w:val="TableGrid"/>
+        <w:tblW w:type="auto" w:w="0"/>
+        <w:tblLook w:firstColumn="1" w:firstRow="1" w:lastColumn="0" w:lastRow="0" w:noHBand="0" w:noVBand="1" w:val="04A0"/>
+      </w:tblPr>
+      <w:tblGrid>
+        <w:gridCol w:w="4680"/>
+        <w:gridCol w:w="4680"/>
+      </w:tblGrid>
+      <w:tr>
+        <w:trPr>
+          <w:cantSplit/>
+        </w:trPr>
+        <w:tc>
+          <w:tcPr>
+            <w:tcW w:type="dxa" w:w="4680"/>
+            <w:vAlign w:val="center"/>
+            <w:shd w:fill="1F416B"/>
+          </w:tcPr>
+          <w:p>
+            <w:pPr>
+              <w:spacing w:after="0"/>
+            </w:pPr>
+            <w:r>
+              <w:rPr>
+                <w:rFonts w:ascii="Arial" w:hAnsi="Arial"/>
+                <w:b/>
+                <w:color w:val="FFFFFF"/>
+                <w:sz w:val="19"/>
+              </w:rPr>
+              <w:t>Momento</w:t>
+            </w:r>
+          </w:p>
+        </w:tc>
+        <w:tc>
+          <w:tcPr>
+            <w:tcW w:type="dxa" w:w="4680"/>
+            <w:vAlign w:val="center"/>
+            <w:shd w:fill="1F416B"/>
+          </w:tcPr>
+          <w:p>
+            <w:pPr>
+              <w:spacing w:after="0"/>
+            </w:pPr>
+            <w:r>
+              <w:rPr>
+                <w:rFonts w:ascii="Arial" w:hAnsi="Arial"/>
+                <w:b/>
+                <w:color w:val="FFFFFF"/>
+                <w:sz w:val="19"/>
+              </w:rPr>
+              <w:t>Comportamento observado</w:t>
+            </w:r>
+          </w:p>
+        </w:tc>
+      </w:tr>
+      <w:tr>
+        <w:trPr>
+          <w:cantSplit/>
+        </w:trPr>
+        <w:tc>
+          <w:tcPr>
+            <w:tcW w:type="dxa" w:w="4680"/>
+            <w:vAlign w:val="center"/>
+            <w:shd w:fill="FFFFFF"/>
+          </w:tcPr>
+          <w:p>
+            <w:pPr>
+              <w:spacing w:after="0"/>
+            </w:pPr>
+            <w:r>
+              <w:rPr>
+                <w:rFonts w:ascii="Arial" w:hAnsi="Arial"/>
+                <w:sz w:val="19"/>
+              </w:rPr>
+              <w:t>Primeira pergunta</w:t>
+            </w:r>
+          </w:p>
+        </w:tc>
+        <w:tc>
+          <w:tcPr>
+            <w:tcW w:type="dxa" w:w="4680"/>
+            <w:vAlign w:val="center"/>
+            <w:shd w:fill="FFFFFF"/>
+          </w:tcPr>
+          <w:p>
+            <w:pPr>
+              <w:spacing w:after="0"/>
+            </w:pPr>
+            <w:r>
+              <w:rPr>
+                <w:rFonts w:ascii="Arial" w:hAnsi="Arial"/>
+                <w:sz w:val="19"/>
+              </w:rPr>
+              <w:t>O mentor recomendou Python como primeira linguagem e SQL como passo seguinte.</w:t>
+            </w:r>
+          </w:p>
+        </w:tc>
+      </w:tr>
+      <w:tr>
+        <w:trPr>
+          <w:cantSplit/>
+        </w:trPr>
+        <w:tc>
+          <w:tcPr>
+            <w:tcW w:type="dxa" w:w="4680"/>
+            <w:vAlign w:val="center"/>
+            <w:shd w:fill="F2F4F7"/>
+          </w:tcPr>
+          <w:p>
+            <w:pPr>
+              <w:spacing w:after="0"/>
+            </w:pPr>
+            <w:r>
+              <w:rPr>
+                <w:rFonts w:ascii="Arial" w:hAnsi="Arial"/>
+                <w:sz w:val="19"/>
+              </w:rPr>
+              <w:t>Segunda pergunta</w:t>
+            </w:r>
+          </w:p>
+        </w:tc>
+        <w:tc>
+          <w:tcPr>
+            <w:tcW w:type="dxa" w:w="4680"/>
+            <w:vAlign w:val="center"/>
+            <w:shd w:fill="F2F4F7"/>
+          </w:tcPr>
+          <w:p>
+            <w:pPr>
+              <w:spacing w:after="0"/>
+            </w:pPr>
+            <w:r>
+              <w:rPr>
+                <w:rFonts w:ascii="Arial" w:hAnsi="Arial"/>
+                <w:sz w:val="19"/>
+              </w:rPr>
+              <w:t>O mentor associou 'essa linguagem' a Python e sugeriu classificação de fácies, análise de sismicidade, processamento sísmico e projetos com dados de poços.</w:t>
+            </w:r>
+          </w:p>
+        </w:tc>
+      </w:tr>
+      <w:tr>
+        <w:trPr>
+          <w:cantSplit/>
+        </w:trPr>
+        <w:tc>
+          <w:tcPr>
+            <w:tcW w:type="dxa" w:w="4680"/>
+            <w:vAlign w:val="center"/>
+            <w:shd w:fill="FFFFFF"/>
+          </w:tcPr>
+          <w:p>
+            <w:pPr>
+              <w:spacing w:after="0"/>
+            </w:pPr>
+            <w:r>
+              <w:rPr>
+                <w:rFonts w:ascii="Arial" w:hAnsi="Arial"/>
+                <w:sz w:val="19"/>
+              </w:rPr>
+              <w:t>Memória</w:t>
+            </w:r>
+          </w:p>
+        </w:tc>
+        <w:tc>
+          <w:tcPr>
+            <w:tcW w:type="dxa" w:w="4680"/>
+            <w:vAlign w:val="center"/>
+            <w:shd w:fill="FFFFFF"/>
+          </w:tcPr>
+          <w:p>
+            <w:pPr>
+              <w:spacing w:after="0"/>
+            </w:pPr>
+            <w:r>
+              <w:rPr>
+                <w:rFonts w:ascii="Arial" w:hAnsi="Arial"/>
+                <w:sz w:val="19"/>
+              </w:rPr>
+              <w:t>A referência indireta foi resolvida sem o usuário repetir o nome da linguagem.</w:t>
+            </w:r>
+          </w:p>
+        </w:tc>
+      </w:tr>
+      <w:tr>
+        <w:trPr>
+          <w:cantSplit/>
+        </w:trPr>
+        <w:tc>
+          <w:tcPr>
+            <w:tcW w:type="dxa" w:w="4680"/>
+            <w:vAlign w:val="center"/>
+            <w:shd w:fill="F2F4F7"/>
+          </w:tcPr>
+          <w:p>
+            <w:pPr>
+              <w:spacing w:after="0"/>
+            </w:pPr>
+            <w:r>
+              <w:rPr>
+                <w:rFonts w:ascii="Arial" w:hAnsi="Arial"/>
+                <w:sz w:val="19"/>
+              </w:rPr>
+              <w:t>Execução</w:t>
+            </w:r>
+          </w:p>
+        </w:tc>
+        <w:tc>
+          <w:tcPr>
+            <w:tcW w:type="dxa" w:w="4680"/>
+            <w:vAlign w:val="center"/>
+            <w:shd w:fill="F2F4F7"/>
+          </w:tcPr>
+          <w:p>
+            <w:pPr>
+              <w:spacing w:after="0"/>
+            </w:pPr>
+            <w:r>
+              <w:rPr>
+                <w:rFonts w:ascii="Arial" w:hAnsi="Arial"/>
+                <w:sz w:val="19"/>
+              </w:rPr>
+              <w:t>Duas respostas impressas; processo finalizado com código de saída zero.</w:t>
+            </w:r>
+          </w:p>
+        </w:tc>
+      </w:tr>
+    </w:tbl>
+    <w:p>
+      <w:pPr>
+        <w:pStyle w:val="Heading2"/>
+        <w:keepNext/>
+      </w:pPr>
+      <w:r>
+        <w:t>11.3 GIF demonstrativo</w:t>
+      </w:r>
+    </w:p>
+    <w:p>
+      <w:r>
+        <w:t>O GIF apresenta uma versão curta e legível da conversa validada. Ele foi gerado a partir do comportamento observado na execução real, sem chave, token, identificador sensível ou conteúdo do arquivo .env.</w:t>
+      </w:r>
+    </w:p>
+    <w:tbl>
+      <w:tblPr>
+        <w:tblStyle w:val="TableGrid"/>
+        <w:tblW w:type="auto" w:w="0"/>
+        <w:tblLook w:firstColumn="1" w:firstRow="1" w:lastColumn="0" w:lastRow="0" w:noHBand="0" w:noVBand="1" w:val="04A0"/>
+      </w:tblPr>
+      <w:tblGrid>
+        <w:gridCol w:w="4680"/>
+        <w:gridCol w:w="4680"/>
+      </w:tblGrid>
+      <w:tr>
+        <w:trPr>
+          <w:cantSplit/>
+        </w:trPr>
+        <w:tc>
+          <w:tcPr>
+            <w:tcW w:type="dxa" w:w="4680"/>
+            <w:vAlign w:val="center"/>
+            <w:shd w:fill="1F416B"/>
+          </w:tcPr>
+          <w:p>
+            <w:pPr>
+              <w:spacing w:after="0"/>
+            </w:pPr>
+            <w:r>
+              <w:rPr>
+                <w:rFonts w:ascii="Arial" w:hAnsi="Arial"/>
+                <w:b/>
+                <w:color w:val="FFFFFF"/>
+                <w:sz w:val="19"/>
+              </w:rPr>
+              <w:t>Propriedade</w:t>
+            </w:r>
+          </w:p>
+        </w:tc>
+        <w:tc>
+          <w:tcPr>
+            <w:tcW w:type="dxa" w:w="4680"/>
+            <w:vAlign w:val="center"/>
+            <w:shd w:fill="1F416B"/>
+          </w:tcPr>
+          <w:p>
+            <w:pPr>
+              <w:spacing w:after="0"/>
+            </w:pPr>
+            <w:r>
+              <w:rPr>
+                <w:rFonts w:ascii="Arial" w:hAnsi="Arial"/>
+                <w:b/>
+                <w:color w:val="FFFFFF"/>
+                <w:sz w:val="19"/>
+              </w:rPr>
+              <w:t>Valor</w:t>
+            </w:r>
+          </w:p>
+        </w:tc>
+      </w:tr>
+      <w:tr>
+        <w:trPr>
+          <w:cantSplit/>
+        </w:trPr>
+        <w:tc>
+          <w:tcPr>
+            <w:tcW w:type="dxa" w:w="4680"/>
+            <w:vAlign w:val="center"/>
+            <w:shd w:fill="FFFFFF"/>
+          </w:tcPr>
+          <w:p>
+            <w:pPr>
+              <w:spacing w:after="0"/>
+            </w:pPr>
+            <w:r>
+              <w:rPr>
+                <w:rFonts w:ascii="Arial" w:hAnsi="Arial"/>
+                <w:sz w:val="19"/>
+              </w:rPr>
+              <w:t>Caminho</w:t>
+            </w:r>
+          </w:p>
+        </w:tc>
+        <w:tc>
+          <w:tcPr>
+            <w:tcW w:type="dxa" w:w="4680"/>
+            <w:vAlign w:val="center"/>
+            <w:shd w:fill="FFFFFF"/>
+          </w:tcPr>
+          <w:p>
+            <w:pPr>
+              <w:spacing w:after="0"/>
+            </w:pPr>
+            <w:r>
+              <w:rPr>
+                <w:rFonts w:ascii="Arial" w:hAnsi="Arial"/>
+                <w:sz w:val="19"/>
+              </w:rPr>
+              <w:t>assets/geoai-mentor-demo.gif</w:t>
+            </w:r>
+          </w:p>
+        </w:tc>
+      </w:tr>
+      <w:tr>
+        <w:trPr>
+          <w:cantSplit/>
+        </w:trPr>
+        <w:tc>
+          <w:tcPr>
+            <w:tcW w:type="dxa" w:w="4680"/>
+            <w:vAlign w:val="center"/>
+            <w:shd w:fill="F2F4F7"/>
+          </w:tcPr>
+          <w:p>
+            <w:pPr>
+              <w:spacing w:after="0"/>
+            </w:pPr>
+            <w:r>
+              <w:rPr>
+                <w:rFonts w:ascii="Arial" w:hAnsi="Arial"/>
+                <w:sz w:val="19"/>
+              </w:rPr>
+              <w:t>Resolução</w:t>
+            </w:r>
+          </w:p>
+        </w:tc>
+        <w:tc>
+          <w:tcPr>
+            <w:tcW w:type="dxa" w:w="4680"/>
+            <w:vAlign w:val="center"/>
+            <w:shd w:fill="F2F4F7"/>
+          </w:tcPr>
+          <w:p>
+            <w:pPr>
+              <w:spacing w:after="0"/>
+            </w:pPr>
+            <w:r>
+              <w:rPr>
+                <w:rFonts w:ascii="Arial" w:hAnsi="Arial"/>
+                <w:sz w:val="19"/>
+              </w:rPr>
+              <w:t>1200 × 675 pixels</w:t>
+            </w:r>
+          </w:p>
+        </w:tc>
+      </w:tr>
+      <w:tr>
+        <w:trPr>
+          <w:cantSplit/>
+        </w:trPr>
+        <w:tc>
+          <w:tcPr>
+            <w:tcW w:type="dxa" w:w="4680"/>
+            <w:vAlign w:val="center"/>
+            <w:shd w:fill="FFFFFF"/>
+          </w:tcPr>
+          <w:p>
+            <w:pPr>
+              <w:spacing w:after="0"/>
+            </w:pPr>
+            <w:r>
+              <w:rPr>
+                <w:rFonts w:ascii="Arial" w:hAnsi="Arial"/>
+                <w:sz w:val="19"/>
+              </w:rPr>
+              <w:t>Conteúdo</w:t>
+            </w:r>
+          </w:p>
+        </w:tc>
+        <w:tc>
+          <w:tcPr>
+            <w:tcW w:type="dxa" w:w="4680"/>
+            <w:vAlign w:val="center"/>
+            <w:shd w:fill="FFFFFF"/>
+          </w:tcPr>
+          <w:p>
+            <w:pPr>
+              <w:spacing w:after="0"/>
+            </w:pPr>
+            <w:r>
+              <w:rPr>
+                <w:rFonts w:ascii="Arial" w:hAnsi="Arial"/>
+                <w:sz w:val="19"/>
+              </w:rPr>
+              <w:t>Comando de execução, duas perguntas, respostas resumidas e confirmação da memória.</w:t>
+            </w:r>
+          </w:p>
+        </w:tc>
+      </w:tr>
+      <w:tr>
+        <w:trPr>
+          <w:cantSplit/>
+        </w:trPr>
+        <w:tc>
+          <w:tcPr>
+            <w:tcW w:type="dxa" w:w="4680"/>
+            <w:vAlign w:val="center"/>
+            <w:shd w:fill="F2F4F7"/>
+          </w:tcPr>
+          <w:p>
+            <w:pPr>
+              <w:spacing w:after="0"/>
+            </w:pPr>
+            <w:r>
+              <w:rPr>
+                <w:rFonts w:ascii="Arial" w:hAnsi="Arial"/>
+                <w:sz w:val="19"/>
+              </w:rPr>
+              <w:t>Uso</w:t>
+            </w:r>
+          </w:p>
+        </w:tc>
+        <w:tc>
+          <w:tcPr>
+            <w:tcW w:type="dxa" w:w="4680"/>
+            <w:vAlign w:val="center"/>
+            <w:shd w:fill="F2F4F7"/>
+          </w:tcPr>
+          <w:p>
+            <w:pPr>
+              <w:spacing w:after="0"/>
+            </w:pPr>
+            <w:r>
+              <w:rPr>
+                <w:rFonts w:ascii="Arial" w:hAnsi="Arial"/>
+                <w:sz w:val="19"/>
+              </w:rPr>
+              <w:t>Visualização automática na abertura do README no GitHub.</w:t>
+            </w:r>
+          </w:p>
+        </w:tc>
+      </w:tr>
+    </w:tbl>
+    <w:p>
+      <w:pPr>
+        <w:pStyle w:val="Heading2"/>
+        <w:keepNext/>
+      </w:pPr>
+      <w:r>
+        <w:t>11.4 Arquitetura explicada no README</w:t>
+      </w:r>
+    </w:p>
+    <w:p>
+      <w:r>
+        <w:t>O README apresenta um diagrama Mermaid e descreve o fluxo em linguagem acessível: a pergunta e o histórico entram no template; o modelo gera a resposta; o parser converte a saída para texto; e o wrapper de memória registra a interação para a próxima chamada.</w:t>
+      </w:r>
+    </w:p>
+    <w:p>
+      <w:pPr>
+        <w:pStyle w:val="Heading2"/>
+        <w:keepNext/>
+      </w:pPr>
+      <w:r>
+        <w:t>11.5 Aprendizados consolidados</w:t>
+      </w:r>
+    </w:p>
+    <w:p>
+      <w:pPr>
+        <w:pStyle w:val="ListBullet"/>
+      </w:pPr>
+      <w:r>
+        <w:t>Templates de prompt transformam instruções de persona em comportamento consistente e reutilizável.</w:t>
+      </w:r>
+    </w:p>
+    <w:p>
+      <w:pPr>
+        <w:pStyle w:val="ListBullet"/>
+      </w:pPr>
+      <w:r>
+        <w:t>Memória conversacional muda uma aplicação sem estado para uma experiência capaz de resolver referências e dar continuidade ao diálogo.</w:t>
+      </w:r>
+    </w:p>
+    <w:p>
+      <w:pPr>
+        <w:pStyle w:val="ListBullet"/>
+      </w:pPr>
+      <w:r>
+        <w:t>O histórico em memória é adequado a protótipos, mas persistência durável é necessária em produção.</w:t>
+      </w:r>
+    </w:p>
+    <w:p>
+      <w:pPr>
+        <w:pStyle w:val="ListBullet"/>
+      </w:pPr>
+      <w:r>
+        <w:t>Consistência entre query, historico, as chaves do wrapper e a estrutura do invoke é indispensável.</w:t>
+      </w:r>
+    </w:p>
+    <w:p>
+      <w:pPr>
+        <w:pStyle w:val="ListBullet"/>
+      </w:pPr>
+      <w:r>
+        <w:t>Segurança, documentação, evidências e reprodução são partes do produto, não apenas complementos do código.</w:t>
+      </w:r>
+    </w:p>
+    <w:p>
+      <w:pPr>
+        <w:pStyle w:val="Heading2"/>
+        <w:keepNext/>
+      </w:pPr>
+      <w:r>
+        <w:t>11.6 Verificações finais</w:t>
+      </w:r>
+    </w:p>
+    <w:tbl>
+      <w:tblPr>
+        <w:tblStyle w:val="TableGrid"/>
+        <w:tblW w:type="auto" w:w="0"/>
+        <w:tblLook w:firstColumn="1" w:firstRow="1" w:lastColumn="0" w:lastRow="0" w:noHBand="0" w:noVBand="1" w:val="04A0"/>
+      </w:tblPr>
+      <w:tblGrid>
+        <w:gridCol w:w="3120"/>
+        <w:gridCol w:w="3120"/>
+        <w:gridCol w:w="3120"/>
+      </w:tblGrid>
+      <w:tr>
+        <w:trPr>
+          <w:cantSplit/>
+          <w:tblHeader w:val="true"/>
+        </w:trPr>
+        <w:tc>
+          <w:tcPr>
+            <w:tcW w:type="dxa" w:w="3120"/>
+            <w:vAlign w:val="center"/>
+            <w:shd w:fill="1F416B"/>
+          </w:tcPr>
+          <w:p>
+            <w:pPr>
+              <w:spacing w:after="0"/>
+            </w:pPr>
+            <w:r>
+              <w:rPr>
+                <w:rFonts w:ascii="Arial" w:hAnsi="Arial"/>
+                <w:b/>
+                <w:color w:val="FFFFFF"/>
+                <w:sz w:val="19"/>
+              </w:rPr>
+              <w:t>Verificação</w:t>
+            </w:r>
+          </w:p>
+        </w:tc>
+        <w:tc>
+          <w:tcPr>
+            <w:tcW w:type="dxa" w:w="3120"/>
+            <w:vAlign w:val="center"/>
+            <w:shd w:fill="1F416B"/>
+          </w:tcPr>
+          <w:p>
+            <w:pPr>
+              <w:spacing w:after="0"/>
+            </w:pPr>
+            <w:r>
+              <w:rPr>
+                <w:rFonts w:ascii="Arial" w:hAnsi="Arial"/>
+                <w:b/>
+                <w:color w:val="FFFFFF"/>
+                <w:sz w:val="19"/>
+              </w:rPr>
+              <w:t>Resultado</w:t>
+            </w:r>
+          </w:p>
+        </w:tc>
+        <w:tc>
+          <w:tcPr>
+            <w:tcW w:type="dxa" w:w="3120"/>
+            <w:vAlign w:val="center"/>
+            <w:shd w:fill="1F416B"/>
+          </w:tcPr>
+          <w:p>
+            <w:pPr>
+              <w:spacing w:after="0"/>
+            </w:pPr>
+            <w:r>
+              <w:rPr>
+                <w:rFonts w:ascii="Arial" w:hAnsi="Arial"/>
+                <w:b/>
+                <w:color w:val="FFFFFF"/>
+                <w:sz w:val="19"/>
+              </w:rPr>
+              <w:t>Evidência</w:t>
+            </w:r>
+          </w:p>
+        </w:tc>
+      </w:tr>
+      <w:tr>
+        <w:trPr>
+          <w:cantSplit/>
+        </w:trPr>
+        <w:tc>
+          <w:tcPr>
+            <w:tcW w:type="dxa" w:w="3120"/>
+            <w:vAlign w:val="center"/>
+            <w:shd w:fill="FFFFFF"/>
+          </w:tcPr>
+          <w:p>
+            <w:pPr>
+              <w:spacing w:after="0"/>
+            </w:pPr>
+            <w:r>
+              <w:rPr>
+                <w:rFonts w:ascii="Arial" w:hAnsi="Arial"/>
+                <w:sz w:val="19"/>
+              </w:rPr>
+              <w:t>Compilação</w:t>
+            </w:r>
+          </w:p>
+        </w:tc>
+        <w:tc>
+          <w:tcPr>
+            <w:tcW w:type="dxa" w:w="3120"/>
+            <w:vAlign w:val="center"/>
+            <w:shd w:fill="FFFFFF"/>
+          </w:tcPr>
+          <w:p>
+            <w:pPr>
+              <w:spacing w:after="0"/>
+            </w:pPr>
+            <w:r>
+              <w:rPr>
+                <w:rFonts w:ascii="Arial" w:hAnsi="Arial"/>
+                <w:sz w:val="19"/>
+              </w:rPr>
+              <w:t>Aprovada</w:t>
+            </w:r>
+          </w:p>
+        </w:tc>
+        <w:tc>
+          <w:tcPr>
+            <w:tcW w:type="dxa" w:w="3120"/>
+            <w:vAlign w:val="center"/>
+            <w:shd w:fill="FFFFFF"/>
+          </w:tcPr>
+          <w:p>
+            <w:pPr>
+              <w:spacing w:after="0"/>
+            </w:pPr>
+            <w:r>
+              <w:rPr>
+                <w:rFonts w:ascii="Arial" w:hAnsi="Arial"/>
+                <w:sz w:val="19"/>
+              </w:rPr>
+              <w:t>chatbot_mentor.py compilou sem erros.</w:t>
+            </w:r>
+          </w:p>
+        </w:tc>
+      </w:tr>
+      <w:tr>
+        <w:trPr>
+          <w:cantSplit/>
+        </w:trPr>
+        <w:tc>
+          <w:tcPr>
+            <w:tcW w:type="dxa" w:w="3120"/>
+            <w:vAlign w:val="center"/>
+            <w:shd w:fill="F2F4F7"/>
+          </w:tcPr>
+          <w:p>
+            <w:pPr>
+              <w:spacing w:after="0"/>
+            </w:pPr>
+            <w:r>
+              <w:rPr>
+                <w:rFonts w:ascii="Arial" w:hAnsi="Arial"/>
+                <w:sz w:val="19"/>
+              </w:rPr>
+              <w:t>API</w:t>
+            </w:r>
+          </w:p>
+        </w:tc>
+        <w:tc>
+          <w:tcPr>
+            <w:tcW w:type="dxa" w:w="3120"/>
+            <w:vAlign w:val="center"/>
+            <w:shd w:fill="F2F4F7"/>
+          </w:tcPr>
+          <w:p>
+            <w:pPr>
+              <w:spacing w:after="0"/>
+            </w:pPr>
+            <w:r>
+              <w:rPr>
+                <w:rFonts w:ascii="Arial" w:hAnsi="Arial"/>
+                <w:sz w:val="19"/>
+              </w:rPr>
+              <w:t>Aprovada</w:t>
+            </w:r>
+          </w:p>
+        </w:tc>
+        <w:tc>
+          <w:tcPr>
+            <w:tcW w:type="dxa" w:w="3120"/>
+            <w:vAlign w:val="center"/>
+            <w:shd w:fill="F2F4F7"/>
+          </w:tcPr>
+          <w:p>
+            <w:pPr>
+              <w:spacing w:after="0"/>
+            </w:pPr>
+            <w:r>
+              <w:rPr>
+                <w:rFonts w:ascii="Arial" w:hAnsi="Arial"/>
+                <w:sz w:val="19"/>
+              </w:rPr>
+              <w:t>Duas respostas reais foram recebidas.</w:t>
+            </w:r>
+          </w:p>
+        </w:tc>
+      </w:tr>
+      <w:tr>
+        <w:trPr>
+          <w:cantSplit/>
+        </w:trPr>
+        <w:tc>
+          <w:tcPr>
+            <w:tcW w:type="dxa" w:w="3120"/>
+            <w:vAlign w:val="center"/>
+            <w:shd w:fill="FFFFFF"/>
+          </w:tcPr>
+          <w:p>
+            <w:pPr>
+              <w:spacing w:after="0"/>
+            </w:pPr>
+            <w:r>
+              <w:rPr>
+                <w:rFonts w:ascii="Arial" w:hAnsi="Arial"/>
+                <w:sz w:val="19"/>
+              </w:rPr>
+              <w:t>Memória</w:t>
+            </w:r>
+          </w:p>
+        </w:tc>
+        <w:tc>
+          <w:tcPr>
+            <w:tcW w:type="dxa" w:w="3120"/>
+            <w:vAlign w:val="center"/>
+            <w:shd w:fill="FFFFFF"/>
+          </w:tcPr>
+          <w:p>
+            <w:pPr>
+              <w:spacing w:after="0"/>
+            </w:pPr>
+            <w:r>
+              <w:rPr>
+                <w:rFonts w:ascii="Arial" w:hAnsi="Arial"/>
+                <w:sz w:val="19"/>
+              </w:rPr>
+              <w:t>Aprovada</w:t>
+            </w:r>
+          </w:p>
+        </w:tc>
+        <w:tc>
+          <w:tcPr>
+            <w:tcW w:type="dxa" w:w="3120"/>
+            <w:vAlign w:val="center"/>
+            <w:shd w:fill="FFFFFF"/>
+          </w:tcPr>
+          <w:p>
+            <w:pPr>
+              <w:spacing w:after="0"/>
+            </w:pPr>
+            <w:r>
+              <w:rPr>
+                <w:rFonts w:ascii="Arial" w:hAnsi="Arial"/>
+                <w:sz w:val="19"/>
+              </w:rPr>
+              <w:t>A segunda resposta recuperou Python do contexto.</w:t>
+            </w:r>
+          </w:p>
+        </w:tc>
+      </w:tr>
+      <w:tr>
+        <w:trPr>
+          <w:cantSplit/>
+        </w:trPr>
+        <w:tc>
+          <w:tcPr>
+            <w:tcW w:type="dxa" w:w="3120"/>
+            <w:vAlign w:val="center"/>
+            <w:shd w:fill="F2F4F7"/>
+          </w:tcPr>
+          <w:p>
+            <w:pPr>
+              <w:spacing w:after="0"/>
+            </w:pPr>
+            <w:r>
+              <w:rPr>
+                <w:rFonts w:ascii="Arial" w:hAnsi="Arial"/>
+                <w:sz w:val="19"/>
+              </w:rPr>
+              <w:t>README</w:t>
+            </w:r>
+          </w:p>
+        </w:tc>
+        <w:tc>
+          <w:tcPr>
+            <w:tcW w:type="dxa" w:w="3120"/>
+            <w:vAlign w:val="center"/>
+            <w:shd w:fill="F2F4F7"/>
+          </w:tcPr>
+          <w:p>
+            <w:pPr>
+              <w:spacing w:after="0"/>
+            </w:pPr>
+            <w:r>
+              <w:rPr>
+                <w:rFonts w:ascii="Arial" w:hAnsi="Arial"/>
+                <w:sz w:val="19"/>
+              </w:rPr>
+              <w:t>Aprovado</w:t>
+            </w:r>
+          </w:p>
+        </w:tc>
+        <w:tc>
+          <w:tcPr>
+            <w:tcW w:type="dxa" w:w="3120"/>
+            <w:vAlign w:val="center"/>
+            <w:shd w:fill="F2F4F7"/>
+          </w:tcPr>
+          <w:p>
+            <w:pPr>
+              <w:spacing w:after="0"/>
+            </w:pPr>
+            <w:r>
+              <w:rPr>
+                <w:rFonts w:ascii="Arial" w:hAnsi="Arial"/>
+                <w:sz w:val="19"/>
+              </w:rPr>
+              <w:t>Configuração, execução, exemplos, arquitetura e aprendizados presentes.</w:t>
+            </w:r>
+          </w:p>
+        </w:tc>
+      </w:tr>
+      <w:tr>
+        <w:trPr>
+          <w:cantSplit/>
+        </w:trPr>
+        <w:tc>
+          <w:tcPr>
+            <w:tcW w:type="dxa" w:w="3120"/>
+            <w:vAlign w:val="center"/>
+            <w:shd w:fill="FFFFFF"/>
+          </w:tcPr>
+          <w:p>
+            <w:pPr>
+              <w:spacing w:after="0"/>
+            </w:pPr>
+            <w:r>
+              <w:rPr>
+                <w:rFonts w:ascii="Arial" w:hAnsi="Arial"/>
+                <w:sz w:val="19"/>
+              </w:rPr>
+              <w:t>GIF</w:t>
+            </w:r>
+          </w:p>
+        </w:tc>
+        <w:tc>
+          <w:tcPr>
+            <w:tcW w:type="dxa" w:w="3120"/>
+            <w:vAlign w:val="center"/>
+            <w:shd w:fill="FFFFFF"/>
+          </w:tcPr>
+          <w:p>
+            <w:pPr>
+              <w:spacing w:after="0"/>
+            </w:pPr>
+            <w:r>
+              <w:rPr>
+                <w:rFonts w:ascii="Arial" w:hAnsi="Arial"/>
+                <w:sz w:val="19"/>
+              </w:rPr>
+              <w:t>Aprovado</w:t>
+            </w:r>
+          </w:p>
+        </w:tc>
+        <w:tc>
+          <w:tcPr>
+            <w:tcW w:type="dxa" w:w="3120"/>
+            <w:vAlign w:val="center"/>
+            <w:shd w:fill="FFFFFF"/>
+          </w:tcPr>
+          <w:p>
+            <w:pPr>
+              <w:spacing w:after="0"/>
+            </w:pPr>
+            <w:r>
+              <w:rPr>
+                <w:rFonts w:ascii="Arial" w:hAnsi="Arial"/>
+                <w:sz w:val="19"/>
+              </w:rPr>
+              <w:t>Arquivo animado criado e primeira moldura inspecionada.</w:t>
+            </w:r>
+          </w:p>
+        </w:tc>
+      </w:tr>
+      <w:tr>
+        <w:trPr>
+          <w:cantSplit/>
+        </w:trPr>
+        <w:tc>
+          <w:tcPr>
+            <w:tcW w:type="dxa" w:w="3120"/>
+            <w:vAlign w:val="center"/>
+            <w:shd w:fill="F2F4F7"/>
+          </w:tcPr>
+          <w:p>
+            <w:pPr>
+              <w:spacing w:after="0"/>
+            </w:pPr>
+            <w:r>
+              <w:rPr>
+                <w:rFonts w:ascii="Arial" w:hAnsi="Arial"/>
+                <w:sz w:val="19"/>
+              </w:rPr>
+              <w:t>Segurança</w:t>
+            </w:r>
+          </w:p>
+        </w:tc>
+        <w:tc>
+          <w:tcPr>
+            <w:tcW w:type="dxa" w:w="3120"/>
+            <w:vAlign w:val="center"/>
+            <w:shd w:fill="F2F4F7"/>
+          </w:tcPr>
+          <w:p>
+            <w:pPr>
+              <w:spacing w:after="0"/>
+            </w:pPr>
+            <w:r>
+              <w:rPr>
+                <w:rFonts w:ascii="Arial" w:hAnsi="Arial"/>
+                <w:sz w:val="19"/>
+              </w:rPr>
+              <w:t>Aprovada</w:t>
+            </w:r>
+          </w:p>
+        </w:tc>
+        <w:tc>
+          <w:tcPr>
+            <w:tcW w:type="dxa" w:w="3120"/>
+            <w:vAlign w:val="center"/>
+            <w:shd w:fill="F2F4F7"/>
+          </w:tcPr>
+          <w:p>
+            <w:pPr>
+              <w:spacing w:after="0"/>
+            </w:pPr>
+            <w:r>
+              <w:rPr>
+                <w:rFonts w:ascii="Arial" w:hAnsi="Arial"/>
+                <w:sz w:val="19"/>
+              </w:rPr>
+              <w:t>Nenhum valor de OPENAI_API_KEY foi registrado.</w:t>
+            </w:r>
+          </w:p>
+        </w:tc>
+      </w:tr>
+    </w:tbl>
+    <w:p>
+      <w:pPr>
+        <w:pStyle w:val="Heading2"/>
+        <w:keepNext/>
+      </w:pPr>
+      <w:r>
+        <w:t>11.7 Observações e próximos passos</w:t>
+      </w:r>
+    </w:p>
+    <w:p>
+      <w:pPr>
+        <w:pStyle w:val="ListBullet"/>
+      </w:pPr>
+      <w:r>
+        <w:t>A versão instalada do LangChain emite aviso de depreciação para RunnableWithMessageHistory; avaliar a persistência do LangGraph na próxima evolução.</w:t>
+      </w:r>
+    </w:p>
+    <w:p>
+      <w:pPr>
+        <w:pStyle w:val="ListBullet"/>
+      </w:pPr>
+      <w:r>
+        <w:t>Revisar git status e git diff antes de preparar o commit, garantindo que .env e temporários permaneçam fora do repositório.</w:t>
+      </w:r>
+    </w:p>
+    <w:p>
+      <w:pPr>
+        <w:pStyle w:val="ListBullet"/>
+      </w:pPr>
+      <w:r>
+        <w:t>Após autorização explícita, criar o commit de encerramento e enviar o projeto ao repositório remoto.</w:t>
+      </w:r>
+    </w:p>
+    <w:p>
+      <w:pPr>
+        <w:pStyle w:val="ListBullet"/>
+      </w:pPr>
+      <w:r>
+        <w:t>Compartilhar o link do GitHub somente depois de confirmar que README, GIF e código estão visíveis no branch principal.</w:t>
+      </w:r>
+    </w:p>
+    <w:p>
+      <w:pPr>
+        <w:pStyle w:val="Heading2"/>
+        <w:keepNext/>
+      </w:pPr>
+      <w:r>
+        <w:t>11.8 Resumo executivo da etapa</w:t>
+      </w:r>
+    </w:p>
+    <w:p>
+      <w:r>
+        <w:t>O projeto passou de protótipo técnico validado para peça de portfólio preparada localmente. A documentação explica o problema e a solução, o GIF demonstra a continuidade da conversa e os resultados reais sustentam as afirmações. A única ação externa pendente é a publicação no GitHub, que depende de autorização específica.</w:t>
       </w:r>
     </w:p>
     <w:sectPr>

</xml_diff>

<commit_message>
Evolui GeoAI Mentor com arquitetura, sessões, RAG e operação
</commit_message>
<xml_diff>
--- a/Analise/RegistroPassoAPasso_Implementacao_GeoAI_Mentor.docx
+++ b/Analise/RegistroPassoAPasso_Implementacao_GeoAI_Mentor.docx
@@ -10784,6 +10784,605 @@
     <w:p>
       <w:r>
         <w:t>O projeto passou de protótipo técnico validado para peça de portfólio preparada localmente. A documentação explica o problema e a solução, o GIF demonstra a continuidade da conversa e os resultados reais sustentam as afirmações. A única ação externa pendente é a publicação no GitHub, que depende de autorização específica.</w:t>
+      </w:r>
+    </w:p>
+    <w:p>
+      <w:r>
+        <w:br w:type="page"/>
+      </w:r>
+    </w:p>
+    <w:p>
+      <w:pPr>
+        <w:pStyle w:val="Heading1"/>
+      </w:pPr>
+      <w:r>
+        <w:t>12. Etapa 8 - Interface Streamlit e testes automatizados</w:t>
+      </w:r>
+    </w:p>
+    <w:p>
+      <w:r>
+        <w:t>Data da implementação: 17/08/2026. Objetivo: transformar o protótipo de terminal em uma experiência de chat amigável, preservando o modelo OpenAI, a persona especializada e a memória por sessão.</w:t>
+      </w:r>
+    </w:p>
+    <w:p>
+      <w:pPr>
+        <w:pStyle w:val="Heading2"/>
+      </w:pPr>
+      <w:r>
+        <w:t>12.1 Itens implementados</w:t>
+      </w:r>
+    </w:p>
+    <w:tbl>
+      <w:tblPr>
+        <w:tblStyle w:val="TableGrid"/>
+        <w:tblW w:type="auto" w:w="0"/>
+        <w:tblLayout w:type="fixed"/>
+        <w:tblLook w:firstColumn="1" w:firstRow="1" w:lastColumn="0" w:lastRow="0" w:noHBand="0" w:noVBand="1" w:val="04A0"/>
+      </w:tblPr>
+      <w:tblGrid>
+        <w:gridCol w:w="3120"/>
+        <w:gridCol w:w="3120"/>
+        <w:gridCol w:w="3120"/>
+      </w:tblGrid>
+      <w:tr>
+        <w:tc>
+          <w:tcPr>
+            <w:tcW w:type="dxa" w:w="1728"/>
+            <w:vAlign w:val="center"/>
+          </w:tcPr>
+          <w:p>
+            <w:pPr>
+              <w:jc w:val="center"/>
+            </w:pPr>
+            <w:r>
+              <w:rPr>
+                <w:b/>
+              </w:rPr>
+              <w:t>Item</w:t>
+            </w:r>
+          </w:p>
+        </w:tc>
+        <w:tc>
+          <w:tcPr>
+            <w:tcW w:type="dxa" w:w="6336"/>
+            <w:vAlign w:val="center"/>
+          </w:tcPr>
+          <w:p>
+            <w:pPr>
+              <w:jc w:val="center"/>
+            </w:pPr>
+            <w:r>
+              <w:rPr>
+                <w:b/>
+              </w:rPr>
+              <w:t>Implementação</w:t>
+            </w:r>
+          </w:p>
+        </w:tc>
+        <w:tc>
+          <w:tcPr>
+            <w:tcW w:type="dxa" w:w="1440"/>
+            <w:vAlign w:val="center"/>
+          </w:tcPr>
+          <w:p>
+            <w:pPr>
+              <w:jc w:val="center"/>
+            </w:pPr>
+            <w:r>
+              <w:rPr>
+                <w:b/>
+              </w:rPr>
+              <w:t>Resultado</w:t>
+            </w:r>
+          </w:p>
+        </w:tc>
+      </w:tr>
+      <w:tr>
+        <w:tc>
+          <w:tcPr>
+            <w:tcW w:type="dxa" w:w="1728"/>
+            <w:vAlign w:val="center"/>
+          </w:tcPr>
+          <w:p>
+            <w:r>
+              <w:t>1. Interface</w:t>
+            </w:r>
+          </w:p>
+        </w:tc>
+        <w:tc>
+          <w:tcPr>
+            <w:tcW w:type="dxa" w:w="6336"/>
+            <w:vAlign w:val="center"/>
+          </w:tcPr>
+          <w:p>
+            <w:r>
+              <w:t>streamlit_app.py com mensagens, entrada de chat, barra lateral e botão Nova conversa.</w:t>
+            </w:r>
+          </w:p>
+        </w:tc>
+        <w:tc>
+          <w:tcPr>
+            <w:tcW w:type="dxa" w:w="1440"/>
+            <w:vAlign w:val="center"/>
+          </w:tcPr>
+          <w:p>
+            <w:r>
+              <w:t>Concluído</w:t>
+            </w:r>
+          </w:p>
+        </w:tc>
+      </w:tr>
+      <w:tr>
+        <w:tc>
+          <w:tcPr>
+            <w:tcW w:type="dxa" w:w="1728"/>
+            <w:vAlign w:val="center"/>
+          </w:tcPr>
+          <w:p>
+            <w:r>
+              <w:t>2. Histórico visual</w:t>
+            </w:r>
+          </w:p>
+        </w:tc>
+        <w:tc>
+          <w:tcPr>
+            <w:tcW w:type="dxa" w:w="6336"/>
+            <w:vAlign w:val="center"/>
+          </w:tcPr>
+          <w:p>
+            <w:r>
+              <w:t>st.session_state armazena o identificador exclusivo e as mensagens exibidas no navegador.</w:t>
+            </w:r>
+          </w:p>
+        </w:tc>
+        <w:tc>
+          <w:tcPr>
+            <w:tcW w:type="dxa" w:w="1440"/>
+            <w:vAlign w:val="center"/>
+          </w:tcPr>
+          <w:p>
+            <w:r>
+              <w:t>Concluído</w:t>
+            </w:r>
+          </w:p>
+        </w:tc>
+      </w:tr>
+      <w:tr>
+        <w:tc>
+          <w:tcPr>
+            <w:tcW w:type="dxa" w:w="1728"/>
+            <w:vAlign w:val="center"/>
+          </w:tcPr>
+          <w:p>
+            <w:r>
+              <w:t>3. Entrada dinâmica</w:t>
+            </w:r>
+          </w:p>
+        </w:tc>
+        <w:tc>
+          <w:tcPr>
+            <w:tcW w:type="dxa" w:w="6336"/>
+            <w:vAlign w:val="center"/>
+          </w:tcPr>
+          <w:p>
+            <w:r>
+              <w:t>Cada texto digitado é enviado pela função perguntar() ao fluxo LangChain com o session_id correto.</w:t>
+            </w:r>
+          </w:p>
+        </w:tc>
+        <w:tc>
+          <w:tcPr>
+            <w:tcW w:type="dxa" w:w="1440"/>
+            <w:vAlign w:val="center"/>
+          </w:tcPr>
+          <w:p>
+            <w:r>
+              <w:t>Concluído</w:t>
+            </w:r>
+          </w:p>
+        </w:tc>
+      </w:tr>
+      <w:tr>
+        <w:tc>
+          <w:tcPr>
+            <w:tcW w:type="dxa" w:w="1728"/>
+            <w:vAlign w:val="center"/>
+          </w:tcPr>
+          <w:p>
+            <w:r>
+              <w:t>6. Portfólio</w:t>
+            </w:r>
+          </w:p>
+        </w:tc>
+        <w:tc>
+          <w:tcPr>
+            <w:tcW w:type="dxa" w:w="6336"/>
+            <w:vAlign w:val="center"/>
+          </w:tcPr>
+          <w:p>
+            <w:r>
+              <w:t>README, testes, GIF demonstrativo e documentos foram atualizados.</w:t>
+            </w:r>
+          </w:p>
+        </w:tc>
+        <w:tc>
+          <w:tcPr>
+            <w:tcW w:type="dxa" w:w="1440"/>
+            <w:vAlign w:val="center"/>
+          </w:tcPr>
+          <w:p>
+            <w:r>
+              <w:t>Concluído</w:t>
+            </w:r>
+          </w:p>
+        </w:tc>
+      </w:tr>
+    </w:tbl>
+    <w:p>
+      <w:pPr>
+        <w:pStyle w:val="Heading2"/>
+      </w:pPr>
+      <w:r>
+        <w:t>12.2 Decisões de arquitetura</w:t>
+      </w:r>
+    </w:p>
+    <w:p>
+      <w:pPr>
+        <w:pStyle w:val="ListBullet"/>
+      </w:pPr>
+      <w:r>
+        <w:t>A memória do LangChain continua responsável pelo contexto enviado ao modelo.</w:t>
+      </w:r>
+    </w:p>
+    <w:p>
+      <w:pPr>
+        <w:pStyle w:val="ListBullet"/>
+      </w:pPr>
+      <w:r>
+        <w:t>O st.session_state conserva apenas o estado da experiência visual em cada navegador.</w:t>
+      </w:r>
+    </w:p>
+    <w:p>
+      <w:pPr>
+        <w:pStyle w:val="ListBullet"/>
+      </w:pPr>
+      <w:r>
+        <w:t>Um UUID separa as conversas; Nova conversa remove o histórico anterior e cria outro identificador.</w:t>
+      </w:r>
+    </w:p>
+    <w:p>
+      <w:pPr>
+        <w:pStyle w:val="ListBullet"/>
+      </w:pPr>
+      <w:r>
+        <w:t>A cadeia é armazenada com st.cache_resource para evitar reconstrução desnecessária a cada atualização da tela.</w:t>
+      </w:r>
+    </w:p>
+    <w:p>
+      <w:pPr>
+        <w:pStyle w:val="ListBullet"/>
+      </w:pPr>
+      <w:r>
+        <w:t>A credencial permanece somente no .env e não é exibida na interface, nos testes ou no GIF.</w:t>
+      </w:r>
+    </w:p>
+    <w:p>
+      <w:pPr>
+        <w:pStyle w:val="Heading2"/>
+        <w:pageBreakBefore/>
+      </w:pPr>
+      <w:r>
+        <w:t>12.3 Evidências técnicas</w:t>
+      </w:r>
+    </w:p>
+    <w:tbl>
+      <w:tblPr>
+        <w:tblStyle w:val="TableGrid"/>
+        <w:tblW w:type="auto" w:w="0"/>
+        <w:tblLayout w:type="fixed"/>
+        <w:tblLook w:firstColumn="1" w:firstRow="1" w:lastColumn="0" w:lastRow="0" w:noHBand="0" w:noVBand="1" w:val="04A0"/>
+      </w:tblPr>
+      <w:tblGrid>
+        <w:gridCol w:w="3120"/>
+        <w:gridCol w:w="3120"/>
+        <w:gridCol w:w="3120"/>
+      </w:tblGrid>
+      <w:tr>
+        <w:tc>
+          <w:tcPr>
+            <w:tcW w:type="dxa" w:w="1800"/>
+            <w:vAlign w:val="center"/>
+          </w:tcPr>
+          <w:p>
+            <w:pPr>
+              <w:jc w:val="center"/>
+            </w:pPr>
+            <w:r>
+              <w:rPr>
+                <w:b/>
+              </w:rPr>
+              <w:t>Verificação</w:t>
+            </w:r>
+          </w:p>
+        </w:tc>
+        <w:tc>
+          <w:tcPr>
+            <w:tcW w:type="dxa" w:w="4032"/>
+            <w:vAlign w:val="center"/>
+          </w:tcPr>
+          <w:p>
+            <w:pPr>
+              <w:jc w:val="center"/>
+            </w:pPr>
+            <w:r>
+              <w:rPr>
+                <w:b/>
+              </w:rPr>
+              <w:t>Comando / mecanismo</w:t>
+            </w:r>
+          </w:p>
+        </w:tc>
+        <w:tc>
+          <w:tcPr>
+            <w:tcW w:type="dxa" w:w="3672"/>
+            <w:vAlign w:val="center"/>
+          </w:tcPr>
+          <w:p>
+            <w:pPr>
+              <w:jc w:val="center"/>
+            </w:pPr>
+            <w:r>
+              <w:rPr>
+                <w:b/>
+              </w:rPr>
+              <w:t>Resultado observado</w:t>
+            </w:r>
+          </w:p>
+        </w:tc>
+      </w:tr>
+      <w:tr>
+        <w:tc>
+          <w:tcPr>
+            <w:tcW w:type="dxa" w:w="1800"/>
+            <w:vAlign w:val="center"/>
+          </w:tcPr>
+          <w:p>
+            <w:r>
+              <w:t>Compilação</w:t>
+            </w:r>
+          </w:p>
+        </w:tc>
+        <w:tc>
+          <w:tcPr>
+            <w:tcW w:type="dxa" w:w="4032"/>
+            <w:vAlign w:val="center"/>
+          </w:tcPr>
+          <w:p>
+            <w:r>
+              <w:t>python -m py_compile chatbot_mentor.py streamlit_app.py</w:t>
+            </w:r>
+          </w:p>
+        </w:tc>
+        <w:tc>
+          <w:tcPr>
+            <w:tcW w:type="dxa" w:w="3672"/>
+            <w:vAlign w:val="center"/>
+          </w:tcPr>
+          <w:p>
+            <w:r>
+              <w:t>Aprovada, sem erros</w:t>
+            </w:r>
+          </w:p>
+        </w:tc>
+      </w:tr>
+      <w:tr>
+        <w:tc>
+          <w:tcPr>
+            <w:tcW w:type="dxa" w:w="1800"/>
+            <w:vAlign w:val="center"/>
+          </w:tcPr>
+          <w:p>
+            <w:r>
+              <w:t>Testes</w:t>
+            </w:r>
+          </w:p>
+        </w:tc>
+        <w:tc>
+          <w:tcPr>
+            <w:tcW w:type="dxa" w:w="4032"/>
+            <w:vAlign w:val="center"/>
+          </w:tcPr>
+          <w:p>
+            <w:r>
+              <w:t>python -m pytest -q</w:t>
+            </w:r>
+          </w:p>
+        </w:tc>
+        <w:tc>
+          <w:tcPr>
+            <w:tcW w:type="dxa" w:w="3672"/>
+            <w:vAlign w:val="center"/>
+          </w:tcPr>
+          <w:p>
+            <w:r>
+              <w:t>6 testes aprovados</w:t>
+            </w:r>
+          </w:p>
+        </w:tc>
+      </w:tr>
+      <w:tr>
+        <w:tc>
+          <w:tcPr>
+            <w:tcW w:type="dxa" w:w="1800"/>
+            <w:vAlign w:val="center"/>
+          </w:tcPr>
+          <w:p>
+            <w:r>
+              <w:t>Memória</w:t>
+            </w:r>
+          </w:p>
+        </w:tc>
+        <w:tc>
+          <w:tcPr>
+            <w:tcW w:type="dxa" w:w="4032"/>
+            <w:vAlign w:val="center"/>
+          </w:tcPr>
+          <w:p>
+            <w:r>
+              <w:t>RunnableLambda sem API</w:t>
+            </w:r>
+          </w:p>
+        </w:tc>
+        <w:tc>
+          <w:tcPr>
+            <w:tcW w:type="dxa" w:w="3672"/>
+            <w:vAlign w:val="center"/>
+          </w:tcPr>
+          <w:p>
+            <w:r>
+              <w:t>Contexto preservado e sessões isoladas</w:t>
+            </w:r>
+          </w:p>
+        </w:tc>
+      </w:tr>
+      <w:tr>
+        <w:tc>
+          <w:tcPr>
+            <w:tcW w:type="dxa" w:w="1800"/>
+            <w:vAlign w:val="center"/>
+          </w:tcPr>
+          <w:p>
+            <w:r>
+              <w:t>Interface</w:t>
+            </w:r>
+          </w:p>
+        </w:tc>
+        <w:tc>
+          <w:tcPr>
+            <w:tcW w:type="dxa" w:w="4032"/>
+            <w:vAlign w:val="center"/>
+          </w:tcPr>
+          <w:p>
+            <w:r>
+              <w:t>streamlit.testing.v1.AppTest</w:t>
+            </w:r>
+          </w:p>
+        </w:tc>
+        <w:tc>
+          <w:tcPr>
+            <w:tcW w:type="dxa" w:w="3672"/>
+            <w:vAlign w:val="center"/>
+          </w:tcPr>
+          <w:p>
+            <w:r>
+              <w:t>Título, mensagem, campo e reinício confirmados</w:t>
+            </w:r>
+          </w:p>
+        </w:tc>
+      </w:tr>
+      <w:tr>
+        <w:tc>
+          <w:tcPr>
+            <w:tcW w:type="dxa" w:w="1800"/>
+            <w:vAlign w:val="center"/>
+          </w:tcPr>
+          <w:p>
+            <w:r>
+              <w:t>GIF</w:t>
+            </w:r>
+          </w:p>
+        </w:tc>
+        <w:tc>
+          <w:tcPr>
+            <w:tcW w:type="dxa" w:w="4032"/>
+            <w:vAlign w:val="center"/>
+          </w:tcPr>
+          <w:p>
+            <w:r>
+              <w:t>scripts/gerar_gif_demo.py</w:t>
+            </w:r>
+          </w:p>
+        </w:tc>
+        <w:tc>
+          <w:tcPr>
+            <w:tcW w:type="dxa" w:w="3672"/>
+            <w:vAlign w:val="center"/>
+          </w:tcPr>
+          <w:p>
+            <w:r>
+              <w:t>4 quadros, 1100 x 680 pixels</w:t>
+            </w:r>
+          </w:p>
+        </w:tc>
+      </w:tr>
+    </w:tbl>
+    <w:p>
+      <w:pPr>
+        <w:pStyle w:val="Heading2"/>
+      </w:pPr>
+      <w:r>
+        <w:t>12.4 Como reproduzir</w:t>
+      </w:r>
+    </w:p>
+    <w:p>
+      <w:pPr>
+        <w:pStyle w:val="ListNumber"/>
+      </w:pPr>
+      <w:r>
+        <w:t>Ative o ambiente virtual com .venv\Scripts\Activate.ps1.</w:t>
+      </w:r>
+    </w:p>
+    <w:p>
+      <w:pPr>
+        <w:pStyle w:val="ListNumber"/>
+      </w:pPr>
+      <w:r>
+        <w:t>Instale a aplicação com pip install -r requirements.txt.</w:t>
+      </w:r>
+    </w:p>
+    <w:p>
+      <w:pPr>
+        <w:pStyle w:val="ListNumber"/>
+      </w:pPr>
+      <w:r>
+        <w:t>Instale os recursos de teste com pip install -r requirements-dev.txt.</w:t>
+      </w:r>
+    </w:p>
+    <w:p>
+      <w:pPr>
+        <w:pStyle w:val="ListNumber"/>
+      </w:pPr>
+      <w:r>
+        <w:t>Execute python -m pytest -q e confirme 6 testes aprovados.</w:t>
+      </w:r>
+    </w:p>
+    <w:p>
+      <w:pPr>
+        <w:pStyle w:val="ListNumber"/>
+      </w:pPr>
+      <w:r>
+        <w:t>Execute streamlit run streamlit_app.py e abra o endereço local informado.</w:t>
+      </w:r>
+    </w:p>
+    <w:p>
+      <w:pPr>
+        <w:pStyle w:val="ListNumber"/>
+      </w:pPr>
+      <w:r>
+        <w:t>Faça uma pergunta e depois outra que dependa da primeira; use Nova conversa para validar o isolamento.</w:t>
+      </w:r>
+    </w:p>
+    <w:p>
+      <w:pPr>
+        <w:pStyle w:val="Heading2"/>
+      </w:pPr>
+      <w:r>
+        <w:t>12.5 Resultado da etapa</w:t>
+      </w:r>
+    </w:p>
+    <w:p>
+      <w:r>
+        <w:t>O GeoAI Mentor agora possui uma interface web local adequada a demonstrações e usuários não técnicos. A entrada deixou de ser uma lista fixa: cada mensagem é digitada pelo usuário, exibida na tela e vinculada à memória da sessão. A implementação foi aprovada por testes automatizados sem consumir créditos da API.</w:t>
       </w:r>
     </w:p>
     <w:sectPr>

</xml_diff>